<commit_message>
Actividades 2.2 y 2.3: correcciones de la revisión del 13 de octubre
Partos sin dato en las variables relacionadas (D38, H26); sensibilidad de traslados y derivados (H27, D39); calidad del identificador por año (H28); grupos de la validación temporal (script 13, D40); métricas con recalibración (D41); ventana de historia de 12 meses (D42). Conjunto analítico y partición en versión 2, con el mismo reparto. Pruebas independientes sin fallas.
</commit_message>
<xml_diff>
--- a/2.3_validacion_particion/bitacora.docx
+++ b/2.3_validacion_particion/bitacora.docx
@@ -38,7 +38,7 @@
           <w:sz w:val="18"/>
           <w:szCs w:val="18"/>
         </w:rPr>
-        <w:t xml:space="preserve">Actualizada al 8 de octubre de 2026 · Versión Word generada a partir de Codigo/2.3_validacion_particion/bitacora.md</w:t>
+        <w:t xml:space="preserve">Actualizada al 20 de octubre de 2026 · Versión Word generada a partir de Codigo/2.3_validacion_particion/bitacora.md</w:t>
       </w:r>
     </w:p>
     <w:p>
@@ -103,7 +103,7 @@
         </w:r>
       </w:hyperlink>
       <w:r>
-        <w:t xml:space="preserve"> y </w:t>
+        <w:t xml:space="preserve">, </w:t>
       </w:r>
       <w:hyperlink w:history="1" w:anchor="E_D37">
         <w:r>
@@ -115,6 +115,30 @@
         </w:r>
       </w:hyperlink>
       <w:r>
+        <w:t xml:space="preserve"> y </w:t>
+      </w:r>
+      <w:hyperlink w:history="1" w:anchor="E_D40">
+        <w:r>
+          <w:rPr>
+            <w:color w:val="0563C1"/>
+            <w:u w:val="single"/>
+          </w:rPr>
+          <w:t xml:space="preserve">D40</w:t>
+        </w:r>
+      </w:hyperlink>
+      <w:r>
+        <w:t xml:space="preserve"> a </w:t>
+      </w:r>
+      <w:hyperlink w:history="1" w:anchor="E_D42">
+        <w:r>
+          <w:rPr>
+            <w:color w:val="0563C1"/>
+            <w:u w:val="single"/>
+          </w:rPr>
+          <w:t xml:space="preserve">D42</w:t>
+        </w:r>
+      </w:hyperlink>
+      <w:r>
         <w:t xml:space="preserve">. Una entrada no se borra: si una decisión cambia, se agrega una nueva entrada que la reemplaza y se indica en el campo </w:t>
       </w:r>
       <w:r>
@@ -155,6 +179,83 @@
       </w:r>
       <w:r>
         <w:t xml:space="preserve">.</w:t>
+      </w:r>
+    </w:p>
+    <w:p>
+      <w:r>
+        <w:t xml:space="preserve">El profesor guía revisó la partición y el esquema de validación el 13 de octubre de 2026: considera que la partición por paciente está bien construida, y aprueba </w:t>
+      </w:r>
+      <w:hyperlink w:history="1" w:anchor="E_D27">
+        <w:r>
+          <w:rPr>
+            <w:color w:val="0563C1"/>
+            <w:u w:val="single"/>
+          </w:rPr>
+          <w:t xml:space="preserve">D27</w:t>
+        </w:r>
+      </w:hyperlink>
+      <w:r>
+        <w:t xml:space="preserve"> a </w:t>
+      </w:r>
+      <w:hyperlink w:history="1" w:anchor="E_D29">
+        <w:r>
+          <w:rPr>
+            <w:color w:val="0563C1"/>
+            <w:u w:val="single"/>
+          </w:rPr>
+          <w:t xml:space="preserve">D29</w:t>
+        </w:r>
+      </w:hyperlink>
+      <w:r>
+        <w:t xml:space="preserve"> y </w:t>
+      </w:r>
+      <w:hyperlink w:history="1" w:anchor="E_D37">
+        <w:r>
+          <w:rPr>
+            <w:color w:val="0563C1"/>
+            <w:u w:val="single"/>
+          </w:rPr>
+          <w:t xml:space="preserve">D37</w:t>
+        </w:r>
+      </w:hyperlink>
+      <w:r>
+        <w:t xml:space="preserve"> a condición de incorporar dos puntos de su revisión: la validación temporal informada en tres grupos (punto 2.2) y las métricas y la calibración (punto 2.3). Los dos quedaron incorporados el 20 de octubre (</w:t>
+      </w:r>
+      <w:hyperlink w:history="1" w:anchor="E_D40">
+        <w:r>
+          <w:rPr>
+            <w:color w:val="0563C1"/>
+            <w:u w:val="single"/>
+          </w:rPr>
+          <w:t xml:space="preserve">D40</w:t>
+        </w:r>
+      </w:hyperlink>
+      <w:r>
+        <w:t xml:space="preserve"> y </w:t>
+      </w:r>
+      <w:hyperlink w:history="1" w:anchor="E_D41">
+        <w:r>
+          <w:rPr>
+            <w:color w:val="0563C1"/>
+            <w:u w:val="single"/>
+          </w:rPr>
+          <w:t xml:space="preserve">D41</w:t>
+        </w:r>
+      </w:hyperlink>
+      <w:r>
+        <w:t xml:space="preserve">). Ese día la partición también se volvió a ejecutar sobre la versión 2 del conjunto analítico (D38 de la bitácora de la 2.2), con el mismo reparto de identificadores (versión 2 de la partición, </w:t>
+      </w:r>
+      <w:hyperlink w:history="1" w:anchor="E_D29">
+        <w:r>
+          <w:rPr>
+            <w:color w:val="0563C1"/>
+            <w:u w:val="single"/>
+          </w:rPr>
+          <w:t xml:space="preserve">D29</w:t>
+        </w:r>
+      </w:hyperlink>
+      <w:r>
+        <w:t xml:space="preserve">).</w:t>
       </w:r>
     </w:p>
     <w:p>
@@ -254,9 +355,9 @@
         <w:tblLayout w:type="fixed"/>
       </w:tblPr>
       <w:tblGrid>
-        <w:gridCol w:w="3110"/>
+        <w:gridCol w:w="3100"/>
         <w:gridCol w:w="1107"/>
-        <w:gridCol w:w="4809"/>
+        <w:gridCol w:w="4819"/>
       </w:tblGrid>
       <w:tr>
         <w:trPr>
@@ -265,7 +366,7 @@
         </w:trPr>
         <w:tc>
           <w:tcPr>
-            <w:tcW w:type="dxa" w:w="3110"/>
+            <w:tcW w:type="dxa" w:w="3100"/>
             <w:shd w:fill="D9E2F3" w:color="auto" w:val="clear"/>
             <w:tcMar>
               <w:top w:type="dxa" w:w="70"/>
@@ -319,7 +420,7 @@
         </w:tc>
         <w:tc>
           <w:tcPr>
-            <w:tcW w:type="dxa" w:w="4809"/>
+            <w:tcW w:type="dxa" w:w="4819"/>
             <w:shd w:fill="D9E2F3" w:color="auto" w:val="clear"/>
             <w:tcMar>
               <w:top w:type="dxa" w:w="70"/>
@@ -352,7 +453,7 @@
         </w:trPr>
         <w:tc>
           <w:tcPr>
-            <w:tcW w:type="dxa" w:w="3110"/>
+            <w:tcW w:type="dxa" w:w="3100"/>
             <w:tcMar>
               <w:top w:type="dxa" w:w="70"/>
               <w:left w:type="dxa" w:w="100"/>
@@ -404,7 +505,7 @@
         </w:tc>
         <w:tc>
           <w:tcPr>
-            <w:tcW w:type="dxa" w:w="4809"/>
+            <w:tcW w:type="dxa" w:w="4819"/>
             <w:tcMar>
               <w:top w:type="dxa" w:w="70"/>
               <w:left w:type="dxa" w:w="100"/>
@@ -434,7 +535,7 @@
         </w:trPr>
         <w:tc>
           <w:tcPr>
-            <w:tcW w:type="dxa" w:w="3110"/>
+            <w:tcW w:type="dxa" w:w="3100"/>
             <w:tcMar>
               <w:top w:type="dxa" w:w="70"/>
               <w:left w:type="dxa" w:w="100"/>
@@ -486,7 +587,7 @@
         </w:tc>
         <w:tc>
           <w:tcPr>
-            <w:tcW w:type="dxa" w:w="4809"/>
+            <w:tcW w:type="dxa" w:w="4819"/>
             <w:tcMar>
               <w:top w:type="dxa" w:w="70"/>
               <w:left w:type="dxa" w:w="100"/>
@@ -516,7 +617,7 @@
         </w:trPr>
         <w:tc>
           <w:tcPr>
-            <w:tcW w:type="dxa" w:w="3110"/>
+            <w:tcW w:type="dxa" w:w="3100"/>
             <w:tcMar>
               <w:top w:type="dxa" w:w="70"/>
               <w:left w:type="dxa" w:w="100"/>
@@ -568,7 +669,7 @@
         </w:tc>
         <w:tc>
           <w:tcPr>
-            <w:tcW w:type="dxa" w:w="4809"/>
+            <w:tcW w:type="dxa" w:w="4819"/>
             <w:tcMar>
               <w:top w:type="dxa" w:w="70"/>
               <w:left w:type="dxa" w:w="100"/>
@@ -614,7 +715,7 @@
         </w:trPr>
         <w:tc>
           <w:tcPr>
-            <w:tcW w:type="dxa" w:w="3110"/>
+            <w:tcW w:type="dxa" w:w="3100"/>
             <w:tcMar>
               <w:top w:type="dxa" w:w="70"/>
               <w:left w:type="dxa" w:w="100"/>
@@ -666,7 +767,7 @@
         </w:tc>
         <w:tc>
           <w:tcPr>
-            <w:tcW w:type="dxa" w:w="4809"/>
+            <w:tcW w:type="dxa" w:w="4819"/>
             <w:tcMar>
               <w:top w:type="dxa" w:w="70"/>
               <w:left w:type="dxa" w:w="100"/>
@@ -685,6 +786,268 @@
                 <w:szCs w:val="20"/>
               </w:rPr>
               <w:t xml:space="preserve">Validación cruzada estratificada de cinco particiones, agrupada por paciente, dentro del conjunto de desarrollo; validación temporal interna; una sola evaluación final en el conjunto de prueba.</w:t>
+            </w:r>
+          </w:p>
+        </w:tc>
+      </w:tr>
+      <w:tr>
+        <w:trPr>
+          <w:cantSplit/>
+          <w:tblHeader w:val="off"/>
+        </w:trPr>
+        <w:tc>
+          <w:tcPr>
+            <w:tcW w:type="dxa" w:w="3100"/>
+            <w:tcMar>
+              <w:top w:type="dxa" w:w="70"/>
+              <w:left w:type="dxa" w:w="100"/>
+              <w:bottom w:type="dxa" w:w="70"/>
+              <w:right w:type="dxa" w:w="100"/>
+            </w:tcMar>
+            <w:vAlign w:val="center"/>
+          </w:tcPr>
+          <w:p>
+            <w:pPr>
+              <w:spacing w:after="0"/>
+            </w:pPr>
+            <w:r>
+              <w:rPr>
+                <w:sz w:val="20"/>
+                <w:szCs w:val="20"/>
+              </w:rPr>
+              <w:t xml:space="preserve">Validación temporal en tres grupos</w:t>
+            </w:r>
+          </w:p>
+        </w:tc>
+        <w:tc>
+          <w:tcPr>
+            <w:tcW w:type="dxa" w:w="1107"/>
+            <w:tcMar>
+              <w:top w:type="dxa" w:w="70"/>
+              <w:left w:type="dxa" w:w="100"/>
+              <w:bottom w:type="dxa" w:w="70"/>
+              <w:right w:type="dxa" w:w="100"/>
+            </w:tcMar>
+            <w:vAlign w:val="center"/>
+          </w:tcPr>
+          <w:p>
+            <w:pPr>
+              <w:spacing w:after="0"/>
+            </w:pPr>
+            <w:hyperlink w:history="1" w:anchor="E_D40">
+              <w:r>
+                <w:rPr>
+                  <w:color w:val="0563C1"/>
+                  <w:sz w:val="20"/>
+                  <w:szCs w:val="20"/>
+                  <w:u w:val="single"/>
+                </w:rPr>
+                <w:t xml:space="preserve">D40</w:t>
+              </w:r>
+            </w:hyperlink>
+          </w:p>
+        </w:tc>
+        <w:tc>
+          <w:tcPr>
+            <w:tcW w:type="dxa" w:w="4819"/>
+            <w:tcMar>
+              <w:top w:type="dxa" w:w="70"/>
+              <w:left w:type="dxa" w:w="100"/>
+              <w:bottom w:type="dxa" w:w="70"/>
+              <w:right w:type="dxa" w:w="100"/>
+            </w:tcMar>
+            <w:vAlign w:val="center"/>
+          </w:tcPr>
+          <w:p>
+            <w:pPr>
+              <w:spacing w:after="0"/>
+            </w:pPr>
+            <w:r>
+              <w:rPr>
+                <w:sz w:val="20"/>
+                <w:szCs w:val="20"/>
+              </w:rPr>
+              <w:t xml:space="preserve">Se informa con todos los casos de 2023 y 2024, solo con los de pacientes nuevos (sin ningún egreso en 2021 ni 2022) y solo con los de pacientes ya vistos. Los grupos quedan fijados en </w:t>
+            </w:r>
+            <w:r>
+              <w:rPr>
+                <w:rFonts w:ascii="Consolas" w:cs="Consolas" w:eastAsia="Consolas" w:hAnsi="Consolas"/>
+                <w:sz w:val="18"/>
+                <w:szCs w:val="18"/>
+                <w:shd w:fill="F2F2F2" w:color="auto" w:val="clear"/>
+              </w:rPr>
+              <w:t xml:space="preserve">validacion_temporal.parquet</w:t>
+            </w:r>
+            <w:r>
+              <w:rPr>
+                <w:sz w:val="20"/>
+                <w:szCs w:val="20"/>
+              </w:rPr>
+              <w:t xml:space="preserve"> (script 13).</w:t>
+            </w:r>
+          </w:p>
+        </w:tc>
+      </w:tr>
+      <w:tr>
+        <w:trPr>
+          <w:cantSplit/>
+          <w:tblHeader w:val="off"/>
+        </w:trPr>
+        <w:tc>
+          <w:tcPr>
+            <w:tcW w:type="dxa" w:w="3100"/>
+            <w:tcMar>
+              <w:top w:type="dxa" w:w="70"/>
+              <w:left w:type="dxa" w:w="100"/>
+              <w:bottom w:type="dxa" w:w="70"/>
+              <w:right w:type="dxa" w:w="100"/>
+            </w:tcMar>
+            <w:vAlign w:val="center"/>
+          </w:tcPr>
+          <w:p>
+            <w:pPr>
+              <w:spacing w:after="0"/>
+            </w:pPr>
+            <w:r>
+              <w:rPr>
+                <w:sz w:val="20"/>
+                <w:szCs w:val="20"/>
+              </w:rPr>
+              <w:t xml:space="preserve">Métricas</w:t>
+            </w:r>
+          </w:p>
+        </w:tc>
+        <w:tc>
+          <w:tcPr>
+            <w:tcW w:type="dxa" w:w="1107"/>
+            <w:tcMar>
+              <w:top w:type="dxa" w:w="70"/>
+              <w:left w:type="dxa" w:w="100"/>
+              <w:bottom w:type="dxa" w:w="70"/>
+              <w:right w:type="dxa" w:w="100"/>
+            </w:tcMar>
+            <w:vAlign w:val="center"/>
+          </w:tcPr>
+          <w:p>
+            <w:pPr>
+              <w:spacing w:after="0"/>
+            </w:pPr>
+            <w:hyperlink w:history="1" w:anchor="E_D41">
+              <w:r>
+                <w:rPr>
+                  <w:color w:val="0563C1"/>
+                  <w:sz w:val="20"/>
+                  <w:szCs w:val="20"/>
+                  <w:u w:val="single"/>
+                </w:rPr>
+                <w:t xml:space="preserve">D41</w:t>
+              </w:r>
+            </w:hyperlink>
+          </w:p>
+        </w:tc>
+        <w:tc>
+          <w:tcPr>
+            <w:tcW w:type="dxa" w:w="4819"/>
+            <w:tcMar>
+              <w:top w:type="dxa" w:w="70"/>
+              <w:left w:type="dxa" w:w="100"/>
+              <w:bottom w:type="dxa" w:w="70"/>
+              <w:right w:type="dxa" w:w="100"/>
+            </w:tcMar>
+            <w:vAlign w:val="center"/>
+          </w:tcPr>
+          <w:p>
+            <w:pPr>
+              <w:spacing w:after="0"/>
+            </w:pPr>
+            <w:r>
+              <w:rPr>
+                <w:sz w:val="20"/>
+                <w:szCs w:val="20"/>
+              </w:rPr>
+              <w:t xml:space="preserve">Área bajo la curva de precisión y exhaustividad junto a la prevalencia, área bajo la curva ROC, puntaje de Brier junto al de referencia y calibración (intercepto y pendiente), con intervalos al 95 % por remuestreo de pacientes; recalibración de Platt si se equilibran las clases.</w:t>
+            </w:r>
+          </w:p>
+        </w:tc>
+      </w:tr>
+      <w:tr>
+        <w:trPr>
+          <w:cantSplit/>
+          <w:tblHeader w:val="off"/>
+        </w:trPr>
+        <w:tc>
+          <w:tcPr>
+            <w:tcW w:type="dxa" w:w="3100"/>
+            <w:tcMar>
+              <w:top w:type="dxa" w:w="70"/>
+              <w:left w:type="dxa" w:w="100"/>
+              <w:bottom w:type="dxa" w:w="70"/>
+              <w:right w:type="dxa" w:w="100"/>
+            </w:tcMar>
+            <w:vAlign w:val="center"/>
+          </w:tcPr>
+          <w:p>
+            <w:pPr>
+              <w:spacing w:after="0"/>
+            </w:pPr>
+            <w:r>
+              <w:rPr>
+                <w:sz w:val="20"/>
+                <w:szCs w:val="20"/>
+              </w:rPr>
+              <w:t xml:space="preserve">Variables de historia (Etapa 3)</w:t>
+            </w:r>
+          </w:p>
+        </w:tc>
+        <w:tc>
+          <w:tcPr>
+            <w:tcW w:type="dxa" w:w="1107"/>
+            <w:tcMar>
+              <w:top w:type="dxa" w:w="70"/>
+              <w:left w:type="dxa" w:w="100"/>
+              <w:bottom w:type="dxa" w:w="70"/>
+              <w:right w:type="dxa" w:w="100"/>
+            </w:tcMar>
+            <w:vAlign w:val="center"/>
+          </w:tcPr>
+          <w:p>
+            <w:pPr>
+              <w:spacing w:after="0"/>
+            </w:pPr>
+            <w:hyperlink w:history="1" w:anchor="E_D42">
+              <w:r>
+                <w:rPr>
+                  <w:color w:val="0563C1"/>
+                  <w:sz w:val="20"/>
+                  <w:szCs w:val="20"/>
+                  <w:u w:val="single"/>
+                </w:rPr>
+                <w:t xml:space="preserve">D42</w:t>
+              </w:r>
+            </w:hyperlink>
+          </w:p>
+        </w:tc>
+        <w:tc>
+          <w:tcPr>
+            <w:tcW w:type="dxa" w:w="4819"/>
+            <w:tcMar>
+              <w:top w:type="dxa" w:w="70"/>
+              <w:left w:type="dxa" w:w="100"/>
+              <w:bottom w:type="dxa" w:w="70"/>
+              <w:right w:type="dxa" w:w="100"/>
+            </w:tcMar>
+            <w:vAlign w:val="center"/>
+          </w:tcPr>
+          <w:p>
+            <w:pPr>
+              <w:spacing w:after="0"/>
+            </w:pPr>
+            <w:r>
+              <w:rPr>
+                <w:sz w:val="20"/>
+                <w:szCs w:val="20"/>
+              </w:rPr>
+              <w:t xml:space="preserve">Solo egresos anteriores al ingreso índice, en una ventana de 12 meses. Se marcan los casos cuya ventana empieza antes del inicio de su bloque (todo 2019 y todo 2021).</w:t>
             </w:r>
           </w:p>
         </w:tc>
@@ -1722,7 +2085,43 @@
                 <w:sz w:val="20"/>
                 <w:szCs w:val="20"/>
               </w:rPr>
-              <w:t xml:space="preserve">Adoptada. Pendiente de validar con profesor guía.</w:t>
+              <w:t xml:space="preserve">Adoptada. Aprobada por el profesor guía el 13 de octubre de 2026 a condición de incorporar los puntos 2.2 y 2.3 de su revisión (validación temporal en tres grupos; métricas y calibración), incorporados el 20 de octubre (</w:t>
+            </w:r>
+            <w:hyperlink w:history="1" w:anchor="E_D40">
+              <w:r>
+                <w:rPr>
+                  <w:color w:val="0563C1"/>
+                  <w:sz w:val="20"/>
+                  <w:szCs w:val="20"/>
+                  <w:u w:val="single"/>
+                </w:rPr>
+                <w:t xml:space="preserve">D40</w:t>
+              </w:r>
+            </w:hyperlink>
+            <w:r>
+              <w:rPr>
+                <w:sz w:val="20"/>
+                <w:szCs w:val="20"/>
+              </w:rPr>
+              <w:t xml:space="preserve"> y </w:t>
+            </w:r>
+            <w:hyperlink w:history="1" w:anchor="E_D41">
+              <w:r>
+                <w:rPr>
+                  <w:color w:val="0563C1"/>
+                  <w:sz w:val="20"/>
+                  <w:szCs w:val="20"/>
+                  <w:u w:val="single"/>
+                </w:rPr>
+                <w:t xml:space="preserve">D41</w:t>
+              </w:r>
+            </w:hyperlink>
+            <w:r>
+              <w:rPr>
+                <w:sz w:val="20"/>
+                <w:szCs w:val="20"/>
+              </w:rPr>
+              <w:t xml:space="preserve">).</w:t>
             </w:r>
           </w:p>
         </w:tc>
@@ -3251,6 +3650,95 @@
                 <w:sz w:val="20"/>
                 <w:szCs w:val="20"/>
               </w:rPr>
+              <w:t xml:space="preserve">Con la versión 2 del conjunto analítico (20 de octubre de 2026)</w:t>
+            </w:r>
+          </w:p>
+        </w:tc>
+        <w:tc>
+          <w:tcPr>
+            <w:tcW w:type="dxa" w:w="7226"/>
+            <w:tcMar>
+              <w:top w:type="dxa" w:w="70"/>
+              <w:left w:type="dxa" w:w="100"/>
+              <w:bottom w:type="dxa" w:w="70"/>
+              <w:right w:type="dxa" w:w="100"/>
+            </w:tcMar>
+          </w:tcPr>
+          <w:p>
+            <w:pPr>
+              <w:keepNext/>
+              <w:spacing w:after="0" w:before="0"/>
+            </w:pPr>
+            <w:r>
+              <w:rPr>
+                <w:sz w:val="20"/>
+                <w:szCs w:val="20"/>
+              </w:rPr>
+              <w:t xml:space="preserve">El reparto no cambió: cada identificador y cada egreso quedó en el mismo conjunto, porque los estratos y el orden dependen de los reingresos positivos, y los partos no tenían ninguno en las variables relacionadas. Esas dos variables ya no incluyen los partos (D38 de la bitácora de la 2.2): </w:t>
+            </w:r>
+            <w:r>
+              <w:rPr>
+                <w:rFonts w:ascii="Consolas" w:cs="Consolas" w:eastAsia="Consolas" w:hAnsi="Consolas"/>
+                <w:sz w:val="18"/>
+                <w:szCs w:val="18"/>
+                <w:shd w:fill="F2F2F2" w:color="auto" w:val="clear"/>
+              </w:rPr>
+              <w:t xml:space="preserve">REING_7D_CDM</w:t>
+            </w:r>
+            <w:r>
+              <w:rPr>
+                <w:sz w:val="20"/>
+                <w:szCs w:val="20"/>
+              </w:rPr>
+              <w:t xml:space="preserve"> tiene 1,265 % en desarrollo (2.861.785 casos con dato) y 1,257 % en prueba (715.458), y </w:t>
+            </w:r>
+            <w:r>
+              <w:rPr>
+                <w:rFonts w:ascii="Consolas" w:cs="Consolas" w:eastAsia="Consolas" w:hAnsi="Consolas"/>
+                <w:sz w:val="18"/>
+                <w:szCs w:val="18"/>
+                <w:shd w:fill="F2F2F2" w:color="auto" w:val="clear"/>
+              </w:rPr>
+              <w:t xml:space="preserve">REING_30D_CDM</w:t>
+            </w:r>
+            <w:r>
+              <w:rPr>
+                <w:sz w:val="20"/>
+                <w:szCs w:val="20"/>
+              </w:rPr>
+              <w:t xml:space="preserve">, 3,553 % (2.798.814) y 3,546 % (699.646). Las de cualquier causa no cambian.</w:t>
+            </w:r>
+          </w:p>
+        </w:tc>
+      </w:tr>
+      <w:tr>
+        <w:trPr>
+          <w:cantSplit/>
+        </w:trPr>
+        <w:tc>
+          <w:tcPr>
+            <w:tcW w:type="dxa" w:w="1800"/>
+            <w:shd w:fill="F2F2F2" w:color="auto" w:val="clear"/>
+            <w:tcMar>
+              <w:top w:type="dxa" w:w="70"/>
+              <w:left w:type="dxa" w:w="100"/>
+              <w:bottom w:type="dxa" w:w="70"/>
+              <w:right w:type="dxa" w:w="100"/>
+            </w:tcMar>
+          </w:tcPr>
+          <w:p>
+            <w:pPr>
+              <w:keepNext/>
+              <w:spacing w:after="0"/>
+            </w:pPr>
+            <w:r>
+              <w:rPr>
+                <w:b/>
+                <w:bCs/>
+                <w:color w:val="404040"/>
+                <w:sz w:val="20"/>
+                <w:szCs w:val="20"/>
+              </w:rPr>
               <w:t xml:space="preserve">Composición</w:t>
             </w:r>
           </w:p>
@@ -3275,7 +3763,7 @@
                 <w:sz w:val="20"/>
                 <w:szCs w:val="20"/>
               </w:rPr>
-              <w:t xml:space="preserve">La mayor diferencia entre las cuatro tasas es de 0,006 puntos porcentuales. En la composición de los casos de estudio, la mayor diferencia entre los dos conjuntos es de 0,08 puntos en el año del alta, 0,08 en el hospital, 0,02 en el sexo, 0,07 en la edad, 0,06 en la CDM y 0,12 en el tipo de ingreso. La tasa a 30 días por año del alta es casi igual en los dos conjuntos (en 2024, 6,45 % en ambos).</w:t>
+              <w:t xml:space="preserve">La mayor diferencia entre las cuatro tasas es de 0,006 puntos porcentuales (0,008 con la versión 2). En la composición de los casos de estudio, la mayor diferencia entre los dos conjuntos es de 0,08 puntos en el año del alta, 0,08 en el hospital, 0,02 en el sexo, 0,07 en la edad, 0,06 en la CDM y 0,12 en el tipo de ingreso. La tasa a 30 días por año del alta es casi igual en los dos conjuntos (en 2024, 6,45 % en ambos).</w:t>
             </w:r>
           </w:p>
         </w:tc>
@@ -3660,7 +4148,43 @@
                 <w:sz w:val="20"/>
                 <w:szCs w:val="20"/>
               </w:rPr>
-              <w:t xml:space="preserve">Adoptada. Pendiente de validar con profesor guía.</w:t>
+              <w:t xml:space="preserve">Adoptada. Aprobada por el profesor guía el 13 de octubre de 2026 a condición de incorporar los puntos 2.2 y 2.3 de su revisión (validación temporal en tres grupos; métricas y calibración), incorporados el 20 de octubre (</w:t>
+            </w:r>
+            <w:hyperlink w:history="1" w:anchor="E_D40">
+              <w:r>
+                <w:rPr>
+                  <w:color w:val="0563C1"/>
+                  <w:sz w:val="20"/>
+                  <w:szCs w:val="20"/>
+                  <w:u w:val="single"/>
+                </w:rPr>
+                <w:t xml:space="preserve">D40</w:t>
+              </w:r>
+            </w:hyperlink>
+            <w:r>
+              <w:rPr>
+                <w:sz w:val="20"/>
+                <w:szCs w:val="20"/>
+              </w:rPr>
+              <w:t xml:space="preserve"> y </w:t>
+            </w:r>
+            <w:hyperlink w:history="1" w:anchor="E_D41">
+              <w:r>
+                <w:rPr>
+                  <w:color w:val="0563C1"/>
+                  <w:sz w:val="20"/>
+                  <w:szCs w:val="20"/>
+                  <w:u w:val="single"/>
+                </w:rPr>
+                <w:t xml:space="preserve">D41</w:t>
+              </w:r>
+            </w:hyperlink>
+            <w:r>
+              <w:rPr>
+                <w:sz w:val="20"/>
+                <w:szCs w:val="20"/>
+              </w:rPr>
+              <w:t xml:space="preserve">).</w:t>
             </w:r>
           </w:p>
         </w:tc>
@@ -3969,7 +4493,7 @@
                 <w:sz w:val="20"/>
                 <w:szCs w:val="20"/>
               </w:rPr>
-              <w:t xml:space="preserve">. Antes de la evaluación final hay que comprobar que el archivo conserva ese hash.</w:t>
+              <w:t xml:space="preserve">.</w:t>
             </w:r>
           </w:p>
         </w:tc>
@@ -4002,7 +4526,7 @@
                 <w:sz w:val="20"/>
                 <w:szCs w:val="20"/>
               </w:rPr>
-              <w:t xml:space="preserve">Contenido</w:t>
+              <w:t xml:space="preserve">Versión 2 (vigente)</w:t>
             </w:r>
           </w:p>
         </w:tc>
@@ -4026,7 +4550,7 @@
                 <w:sz w:val="20"/>
                 <w:szCs w:val="20"/>
               </w:rPr>
-              <w:t xml:space="preserve">Los dos archivos tienen las 163 columnas del conjunto analítico, sin ningún cambio. </w:t>
+              <w:t xml:space="preserve">Del 20 de octubre de 2026, sobre la versión 2 del conjunto analítico (D38 de la bitácora de la 2.2). Conjunto de prueba, </w:t>
             </w:r>
             <w:r>
               <w:rPr>
@@ -4035,14 +4559,14 @@
                 <w:szCs w:val="18"/>
                 <w:shd w:fill="F2F2F2" w:color="auto" w:val="clear"/>
               </w:rPr>
-              <w:t xml:space="preserve">data/processed/particion.parquet</w:t>
-            </w:r>
-            <w:r>
-              <w:rPr>
-                <w:sz w:val="20"/>
-                <w:szCs w:val="20"/>
-              </w:rPr>
-              <w:t xml:space="preserve"> indica el conjunto de cada egreso y </w:t>
+              <w:t xml:space="preserve">3b34135288309a40463f23cd509b3d113f6a32c94c03a88a3bbbc6386338d2b2</w:t>
+            </w:r>
+            <w:r>
+              <w:rPr>
+                <w:sz w:val="20"/>
+                <w:szCs w:val="20"/>
+              </w:rPr>
+              <w:t xml:space="preserve">; conjunto de desarrollo, </w:t>
             </w:r>
             <w:r>
               <w:rPr>
@@ -4051,14 +4575,30 @@
                 <w:szCs w:val="18"/>
                 <w:shd w:fill="F2F2F2" w:color="auto" w:val="clear"/>
               </w:rPr>
-              <w:t xml:space="preserve">data/processed/particion_identificadores.parquet</w:t>
-            </w:r>
-            <w:r>
-              <w:rPr>
-                <w:sz w:val="20"/>
-                <w:szCs w:val="20"/>
-              </w:rPr>
-              <w:t xml:space="preserve">, el de cada identificador; ninguno de los dos contiene nada que dependa de las variables objetivo.</w:t>
+              <w:t xml:space="preserve">9546c8c7e80f634295e7c0538173661884aa6ce602e201a3cbd8ae615912abbb</w:t>
+            </w:r>
+            <w:r>
+              <w:rPr>
+                <w:sz w:val="20"/>
+                <w:szCs w:val="20"/>
+              </w:rPr>
+              <w:t xml:space="preserve">. La lista de identificadores conserva el hash de la versión 1 (</w:t>
+            </w:r>
+            <w:r>
+              <w:rPr>
+                <w:rFonts w:ascii="Consolas" w:cs="Consolas" w:eastAsia="Consolas" w:hAnsi="Consolas"/>
+                <w:sz w:val="18"/>
+                <w:szCs w:val="18"/>
+                <w:shd w:fill="F2F2F2" w:color="auto" w:val="clear"/>
+              </w:rPr>
+              <w:t xml:space="preserve">5bdb99e4f7d9d9a7a9004545ce9e93c85fc172de6e93d2ff111577a42ac5f28b</w:t>
+            </w:r>
+            <w:r>
+              <w:rPr>
+                <w:sz w:val="20"/>
+                <w:szCs w:val="20"/>
+              </w:rPr>
+              <w:t xml:space="preserve">): el reparto es idéntico y dentro de los archivos solo cambiaron las dos variables relacionadas de los partos. El conjunto de prueba no se abrió para nada más que regenerarlo. Antes de la evaluación final hay que comprobar que el archivo conserva el hash de la versión 2.</w:t>
             </w:r>
           </w:p>
         </w:tc>
@@ -4091,7 +4631,7 @@
                 <w:sz w:val="20"/>
                 <w:szCs w:val="20"/>
               </w:rPr>
-              <w:t xml:space="preserve">Antes de repartir</w:t>
+              <w:t xml:space="preserve">Contenido</w:t>
             </w:r>
           </w:p>
         </w:tc>
@@ -4115,7 +4655,39 @@
                 <w:sz w:val="20"/>
                 <w:szCs w:val="20"/>
               </w:rPr>
-              <w:t xml:space="preserve">El script comprueba que la tabla que lee sea la última versión registrada del conjunto analítico, y se detiene si no lo es.</w:t>
+              <w:t xml:space="preserve">Los dos archivos tienen las 163 columnas del conjunto analítico, sin ningún cambio. </w:t>
+            </w:r>
+            <w:r>
+              <w:rPr>
+                <w:rFonts w:ascii="Consolas" w:cs="Consolas" w:eastAsia="Consolas" w:hAnsi="Consolas"/>
+                <w:sz w:val="18"/>
+                <w:szCs w:val="18"/>
+                <w:shd w:fill="F2F2F2" w:color="auto" w:val="clear"/>
+              </w:rPr>
+              <w:t xml:space="preserve">data/processed/particion.parquet</w:t>
+            </w:r>
+            <w:r>
+              <w:rPr>
+                <w:sz w:val="20"/>
+                <w:szCs w:val="20"/>
+              </w:rPr>
+              <w:t xml:space="preserve"> indica el conjunto de cada egreso y </w:t>
+            </w:r>
+            <w:r>
+              <w:rPr>
+                <w:rFonts w:ascii="Consolas" w:cs="Consolas" w:eastAsia="Consolas" w:hAnsi="Consolas"/>
+                <w:sz w:val="18"/>
+                <w:szCs w:val="18"/>
+                <w:shd w:fill="F2F2F2" w:color="auto" w:val="clear"/>
+              </w:rPr>
+              <w:t xml:space="preserve">data/processed/particion_identificadores.parquet</w:t>
+            </w:r>
+            <w:r>
+              <w:rPr>
+                <w:sz w:val="20"/>
+                <w:szCs w:val="20"/>
+              </w:rPr>
+              <w:t xml:space="preserve">, el de cada identificador; ninguno de los dos contiene nada que dependa de las variables objetivo.</w:t>
             </w:r>
           </w:p>
         </w:tc>
@@ -4148,7 +4720,7 @@
                 <w:sz w:val="20"/>
                 <w:szCs w:val="20"/>
               </w:rPr>
-              <w:t xml:space="preserve">Qué se miró del conjunto de prueba</w:t>
+              <w:t xml:space="preserve">Antes de repartir</w:t>
             </w:r>
           </w:p>
         </w:tc>
@@ -4172,7 +4744,7 @@
                 <w:sz w:val="20"/>
                 <w:szCs w:val="20"/>
               </w:rPr>
-              <w:t xml:space="preserve">Solo las cifras agregadas necesarias para comprobar la partición (tamaño, tasas y composición), que están en el reporte 10.</w:t>
+              <w:t xml:space="preserve">El script comprueba que la tabla que lee sea la última versión registrada del conjunto analítico, y se detiene si no lo es.</w:t>
             </w:r>
           </w:p>
         </w:tc>
@@ -4205,7 +4777,7 @@
                 <w:sz w:val="20"/>
                 <w:szCs w:val="20"/>
               </w:rPr>
-              <w:t xml:space="preserve">Advertencia para la etapa siguiente</w:t>
+              <w:t xml:space="preserve">Qué se miró del conjunto de prueba</w:t>
             </w:r>
           </w:p>
         </w:tc>
@@ -4226,35 +4798,10 @@
             </w:pPr>
             <w:r>
               <w:rPr>
-                <w:rFonts w:ascii="Consolas" w:cs="Consolas" w:eastAsia="Consolas" w:hAnsi="Consolas"/>
-                <w:sz w:val="18"/>
-                <w:szCs w:val="18"/>
-                <w:shd w:fill="F2F2F2" w:color="auto" w:val="clear"/>
-              </w:rPr>
-              <w:t xml:space="preserve">DIAS_REING</w:t>
-            </w:r>
-            <w:r>
-              <w:rPr>
-                <w:sz w:val="20"/>
-                <w:szCs w:val="20"/>
-              </w:rPr>
-              <w:t xml:space="preserve"> e </w:t>
-            </w:r>
-            <w:r>
-              <w:rPr>
-                <w:rFonts w:ascii="Consolas" w:cs="Consolas" w:eastAsia="Consolas" w:hAnsi="Consolas"/>
-                <w:sz w:val="18"/>
-                <w:szCs w:val="18"/>
-                <w:shd w:fill="F2F2F2" w:color="auto" w:val="clear"/>
-              </w:rPr>
-              <w:t xml:space="preserve">ID_EGRESO_REING</w:t>
-            </w:r>
-            <w:r>
-              <w:rPr>
-                <w:sz w:val="20"/>
-                <w:szCs w:val="20"/>
-              </w:rPr>
-              <w:t xml:space="preserve"> describen lo que ocurre después del alta y no son variables predictoras. Toda variable que cuente hospitalizaciones de una persona debe limitarse a las anteriores al alta del caso de estudio (H18 de la bitácora de la 2.2).</w:t>
+                <w:sz w:val="20"/>
+                <w:szCs w:val="20"/>
+              </w:rPr>
+              <w:t xml:space="preserve">Solo las cifras agregadas necesarias para comprobar la partición (tamaño, tasas y composición), que están en el reporte 10.</w:t>
             </w:r>
           </w:p>
         </w:tc>
@@ -4276,7 +4823,7 @@
           </w:tcPr>
           <w:p>
             <w:pPr>
-              <w:keepNext w:val="false"/>
+              <w:keepNext/>
               <w:spacing w:after="0"/>
             </w:pPr>
             <w:r>
@@ -4287,6 +4834,126 @@
                 <w:sz w:val="20"/>
                 <w:szCs w:val="20"/>
               </w:rPr>
+              <w:t xml:space="preserve">Advertencia para la etapa siguiente</w:t>
+            </w:r>
+          </w:p>
+        </w:tc>
+        <w:tc>
+          <w:tcPr>
+            <w:tcW w:type="dxa" w:w="7226"/>
+            <w:tcMar>
+              <w:top w:type="dxa" w:w="70"/>
+              <w:left w:type="dxa" w:w="100"/>
+              <w:bottom w:type="dxa" w:w="70"/>
+              <w:right w:type="dxa" w:w="100"/>
+            </w:tcMar>
+          </w:tcPr>
+          <w:p>
+            <w:pPr>
+              <w:keepNext/>
+              <w:spacing w:after="0" w:before="0"/>
+            </w:pPr>
+            <w:r>
+              <w:rPr>
+                <w:rFonts w:ascii="Consolas" w:cs="Consolas" w:eastAsia="Consolas" w:hAnsi="Consolas"/>
+                <w:sz w:val="18"/>
+                <w:szCs w:val="18"/>
+                <w:shd w:fill="F2F2F2" w:color="auto" w:val="clear"/>
+              </w:rPr>
+              <w:t xml:space="preserve">DIAS_REING</w:t>
+            </w:r>
+            <w:r>
+              <w:rPr>
+                <w:sz w:val="20"/>
+                <w:szCs w:val="20"/>
+              </w:rPr>
+              <w:t xml:space="preserve"> e </w:t>
+            </w:r>
+            <w:r>
+              <w:rPr>
+                <w:rFonts w:ascii="Consolas" w:cs="Consolas" w:eastAsia="Consolas" w:hAnsi="Consolas"/>
+                <w:sz w:val="18"/>
+                <w:szCs w:val="18"/>
+                <w:shd w:fill="F2F2F2" w:color="auto" w:val="clear"/>
+              </w:rPr>
+              <w:t xml:space="preserve">ID_EGRESO_REING</w:t>
+            </w:r>
+            <w:r>
+              <w:rPr>
+                <w:sz w:val="20"/>
+                <w:szCs w:val="20"/>
+              </w:rPr>
+              <w:t xml:space="preserve"> describen lo que ocurre después del alta y no son variables predictoras. Toda variable que cuente hospitalizaciones de una persona debe limitarse a las anteriores al alta del caso de estudio (H18 de la bitácora de la 2.2). </w:t>
+            </w:r>
+            <w:r>
+              <w:rPr>
+                <w:b/>
+                <w:bCs/>
+                <w:sz w:val="20"/>
+                <w:szCs w:val="20"/>
+              </w:rPr>
+              <w:t xml:space="preserve">Precisada por </w:t>
+            </w:r>
+            <w:hyperlink w:history="1" w:anchor="E_D42">
+              <w:r>
+                <w:rPr>
+                  <w:b/>
+                  <w:bCs/>
+                  <w:color w:val="0563C1"/>
+                  <w:sz w:val="20"/>
+                  <w:szCs w:val="20"/>
+                  <w:u w:val="single"/>
+                </w:rPr>
+                <w:t xml:space="preserve">D42</w:t>
+              </w:r>
+            </w:hyperlink>
+            <w:r>
+              <w:rPr>
+                <w:b/>
+                <w:bCs/>
+                <w:sz w:val="20"/>
+                <w:szCs w:val="20"/>
+              </w:rPr>
+              <w:t xml:space="preserve">:</w:t>
+            </w:r>
+            <w:r>
+              <w:rPr>
+                <w:sz w:val="20"/>
+                <w:szCs w:val="20"/>
+              </w:rPr>
+              <w:t xml:space="preserve"> a las anteriores al ingreso índice, en una ventana de 12 meses.</w:t>
+            </w:r>
+          </w:p>
+        </w:tc>
+      </w:tr>
+      <w:tr>
+        <w:trPr>
+          <w:cantSplit/>
+        </w:trPr>
+        <w:tc>
+          <w:tcPr>
+            <w:tcW w:type="dxa" w:w="1800"/>
+            <w:shd w:fill="F2F2F2" w:color="auto" w:val="clear"/>
+            <w:tcMar>
+              <w:top w:type="dxa" w:w="70"/>
+              <w:left w:type="dxa" w:w="100"/>
+              <w:bottom w:type="dxa" w:w="70"/>
+              <w:right w:type="dxa" w:w="100"/>
+            </w:tcMar>
+          </w:tcPr>
+          <w:p>
+            <w:pPr>
+              <w:keepNext w:val="false"/>
+              <w:spacing w:after="0"/>
+            </w:pPr>
+            <w:r>
+              <w:rPr>
+                <w:b/>
+                <w:bCs/>
+                <w:color w:val="404040"/>
+                <w:sz w:val="20"/>
+                <w:szCs w:val="20"/>
+              </w:rPr>
               <w:t xml:space="preserve">Estado</w:t>
             </w:r>
           </w:p>
@@ -4311,7 +4978,43 @@
                 <w:sz w:val="20"/>
                 <w:szCs w:val="20"/>
               </w:rPr>
-              <w:t xml:space="preserve">Adoptada. Pendiente de validar con profesor guía.</w:t>
+              <w:t xml:space="preserve">Adoptada. Aprobada por el profesor guía el 13 de octubre de 2026 a condición de incorporar los puntos 2.2 y 2.3 de su revisión (validación temporal en tres grupos; métricas y calibración), incorporados el 20 de octubre (</w:t>
+            </w:r>
+            <w:hyperlink w:history="1" w:anchor="E_D40">
+              <w:r>
+                <w:rPr>
+                  <w:color w:val="0563C1"/>
+                  <w:sz w:val="20"/>
+                  <w:szCs w:val="20"/>
+                  <w:u w:val="single"/>
+                </w:rPr>
+                <w:t xml:space="preserve">D40</w:t>
+              </w:r>
+            </w:hyperlink>
+            <w:r>
+              <w:rPr>
+                <w:sz w:val="20"/>
+                <w:szCs w:val="20"/>
+              </w:rPr>
+              <w:t xml:space="preserve"> y </w:t>
+            </w:r>
+            <w:hyperlink w:history="1" w:anchor="E_D41">
+              <w:r>
+                <w:rPr>
+                  <w:color w:val="0563C1"/>
+                  <w:sz w:val="20"/>
+                  <w:szCs w:val="20"/>
+                  <w:u w:val="single"/>
+                </w:rPr>
+                <w:t xml:space="preserve">D41</w:t>
+              </w:r>
+            </w:hyperlink>
+            <w:r>
+              <w:rPr>
+                <w:sz w:val="20"/>
+                <w:szCs w:val="20"/>
+              </w:rPr>
+              <w:t xml:space="preserve">).</w:t>
             </w:r>
           </w:p>
         </w:tc>
@@ -4863,7 +5566,7 @@
           </w:tcPr>
           <w:p>
             <w:pPr>
-              <w:keepNext w:val="false"/>
+              <w:keepNext/>
               <w:spacing w:after="0"/>
             </w:pPr>
             <w:r>
@@ -4874,6 +5577,92 @@
                 <w:sz w:val="20"/>
                 <w:szCs w:val="20"/>
               </w:rPr>
+              <w:t xml:space="preserve">Completada por</w:t>
+            </w:r>
+          </w:p>
+        </w:tc>
+        <w:tc>
+          <w:tcPr>
+            <w:tcW w:type="dxa" w:w="7226"/>
+            <w:tcMar>
+              <w:top w:type="dxa" w:w="70"/>
+              <w:left w:type="dxa" w:w="100"/>
+              <w:bottom w:type="dxa" w:w="70"/>
+              <w:right w:type="dxa" w:w="100"/>
+            </w:tcMar>
+          </w:tcPr>
+          <w:p>
+            <w:pPr>
+              <w:keepNext/>
+              <w:spacing w:after="0" w:before="0"/>
+            </w:pPr>
+            <w:hyperlink w:history="1" w:anchor="E_D40">
+              <w:r>
+                <w:rPr>
+                  <w:color w:val="0563C1"/>
+                  <w:sz w:val="20"/>
+                  <w:szCs w:val="20"/>
+                  <w:u w:val="single"/>
+                </w:rPr>
+                <w:t xml:space="preserve">D40</w:t>
+              </w:r>
+            </w:hyperlink>
+            <w:r>
+              <w:rPr>
+                <w:sz w:val="20"/>
+                <w:szCs w:val="20"/>
+              </w:rPr>
+              <w:t xml:space="preserve"> (la validación temporal se informa en tres grupos) y </w:t>
+            </w:r>
+            <w:hyperlink w:history="1" w:anchor="E_D41">
+              <w:r>
+                <w:rPr>
+                  <w:color w:val="0563C1"/>
+                  <w:sz w:val="20"/>
+                  <w:szCs w:val="20"/>
+                  <w:u w:val="single"/>
+                </w:rPr>
+                <w:t xml:space="preserve">D41</w:t>
+              </w:r>
+            </w:hyperlink>
+            <w:r>
+              <w:rPr>
+                <w:sz w:val="20"/>
+                <w:szCs w:val="20"/>
+              </w:rPr>
+              <w:t xml:space="preserve"> (métricas, intervalos y recalibración).</w:t>
+            </w:r>
+          </w:p>
+        </w:tc>
+      </w:tr>
+      <w:tr>
+        <w:trPr>
+          <w:cantSplit/>
+        </w:trPr>
+        <w:tc>
+          <w:tcPr>
+            <w:tcW w:type="dxa" w:w="1800"/>
+            <w:shd w:fill="F2F2F2" w:color="auto" w:val="clear"/>
+            <w:tcMar>
+              <w:top w:type="dxa" w:w="70"/>
+              <w:left w:type="dxa" w:w="100"/>
+              <w:bottom w:type="dxa" w:w="70"/>
+              <w:right w:type="dxa" w:w="100"/>
+            </w:tcMar>
+          </w:tcPr>
+          <w:p>
+            <w:pPr>
+              <w:keepNext w:val="false"/>
+              <w:spacing w:after="0"/>
+            </w:pPr>
+            <w:r>
+              <w:rPr>
+                <w:b/>
+                <w:bCs/>
+                <w:color w:val="404040"/>
+                <w:sz w:val="20"/>
+                <w:szCs w:val="20"/>
+              </w:rPr>
               <w:t xml:space="preserve">Estado</w:t>
             </w:r>
           </w:p>
@@ -4898,7 +5687,3351 @@
                 <w:sz w:val="20"/>
                 <w:szCs w:val="20"/>
               </w:rPr>
-              <w:t xml:space="preserve">Adoptada. Pendiente de validar con profesor guía.</w:t>
+              <w:t xml:space="preserve">Adoptada. Aprobada por el profesor guía el 13 de octubre de 2026 a condición de incorporar los puntos 2.2 y 2.3 de su revisión (validación temporal en tres grupos; métricas y calibración), incorporados el 20 de octubre (</w:t>
+            </w:r>
+            <w:hyperlink w:history="1" w:anchor="E_D40">
+              <w:r>
+                <w:rPr>
+                  <w:color w:val="0563C1"/>
+                  <w:sz w:val="20"/>
+                  <w:szCs w:val="20"/>
+                  <w:u w:val="single"/>
+                </w:rPr>
+                <w:t xml:space="preserve">D40</w:t>
+              </w:r>
+            </w:hyperlink>
+            <w:r>
+              <w:rPr>
+                <w:sz w:val="20"/>
+                <w:szCs w:val="20"/>
+              </w:rPr>
+              <w:t xml:space="preserve"> y </w:t>
+            </w:r>
+            <w:hyperlink w:history="1" w:anchor="E_D41">
+              <w:r>
+                <w:rPr>
+                  <w:color w:val="0563C1"/>
+                  <w:sz w:val="20"/>
+                  <w:szCs w:val="20"/>
+                  <w:u w:val="single"/>
+                </w:rPr>
+                <w:t xml:space="preserve">D41</w:t>
+              </w:r>
+            </w:hyperlink>
+            <w:r>
+              <w:rPr>
+                <w:sz w:val="20"/>
+                <w:szCs w:val="20"/>
+              </w:rPr>
+              <w:t xml:space="preserve">).</w:t>
+            </w:r>
+          </w:p>
+        </w:tc>
+      </w:tr>
+    </w:tbl>
+    <w:p>
+      <w:pPr>
+        <w:pStyle w:val="Heading2"/>
+      </w:pPr>
+      <w:bookmarkStart w:name="E_D40" w:id="6"/>
+      <w:r>
+        <w:rPr>
+          <w:color w:val="548235"/>
+        </w:rPr>
+        <w:t xml:space="preserve">D40</w:t>
+      </w:r>
+      <w:bookmarkEnd w:id="6"/>
+      <w:r>
+        <w:t xml:space="preserve"> · La validación temporal se informa en tres grupos</w:t>
+      </w:r>
+    </w:p>
+    <w:p>
+      <w:pPr>
+        <w:keepNext/>
+        <w:spacing w:after="100"/>
+      </w:pPr>
+      <w:r>
+        <w:rPr>
+          <w:b/>
+          <w:bCs/>
+          <w:color w:val="548235"/>
+          <w:sz w:val="18"/>
+          <w:szCs w:val="18"/>
+        </w:rPr>
+        <w:t xml:space="preserve">Decisión</w:t>
+      </w:r>
+      <w:r>
+        <w:rPr>
+          <w:color w:val="808080"/>
+          <w:sz w:val="18"/>
+          <w:szCs w:val="18"/>
+        </w:rPr>
+        <w:t xml:space="preserve">  ·  20 de octubre de 2026</w:t>
+      </w:r>
+    </w:p>
+    <w:tbl>
+      <w:tblPr>
+        <w:tblW w:type="dxa" w:w="9026"/>
+        <w:tblBorders>
+          <w:top w:val="single" w:color="BFBFBF" w:sz="4"/>
+          <w:left w:val="single" w:color="BFBFBF" w:sz="4"/>
+          <w:bottom w:val="single" w:color="BFBFBF" w:sz="4"/>
+          <w:right w:val="single" w:color="BFBFBF" w:sz="4"/>
+          <w:insideH w:val="single" w:color="BFBFBF" w:sz="4"/>
+          <w:insideV w:val="single" w:color="BFBFBF" w:sz="4"/>
+        </w:tblBorders>
+        <w:tblLayout w:type="fixed"/>
+      </w:tblPr>
+      <w:tblGrid>
+        <w:gridCol w:w="1800"/>
+        <w:gridCol w:w="7226"/>
+      </w:tblGrid>
+      <w:tr>
+        <w:trPr>
+          <w:cantSplit/>
+        </w:trPr>
+        <w:tc>
+          <w:tcPr>
+            <w:tcW w:type="dxa" w:w="1800"/>
+            <w:shd w:fill="F2F2F2" w:color="auto" w:val="clear"/>
+            <w:tcMar>
+              <w:top w:type="dxa" w:w="70"/>
+              <w:left w:type="dxa" w:w="100"/>
+              <w:bottom w:type="dxa" w:w="70"/>
+              <w:right w:type="dxa" w:w="100"/>
+            </w:tcMar>
+          </w:tcPr>
+          <w:p>
+            <w:pPr>
+              <w:keepNext/>
+              <w:spacing w:after="0"/>
+            </w:pPr>
+            <w:r>
+              <w:rPr>
+                <w:b/>
+                <w:bCs/>
+                <w:color w:val="404040"/>
+                <w:sz w:val="20"/>
+                <w:szCs w:val="20"/>
+              </w:rPr>
+              <w:t xml:space="preserve">Actividad</w:t>
+            </w:r>
+          </w:p>
+        </w:tc>
+        <w:tc>
+          <w:tcPr>
+            <w:tcW w:type="dxa" w:w="7226"/>
+            <w:tcMar>
+              <w:top w:type="dxa" w:w="70"/>
+              <w:left w:type="dxa" w:w="100"/>
+              <w:bottom w:type="dxa" w:w="70"/>
+              <w:right w:type="dxa" w:w="100"/>
+            </w:tcMar>
+          </w:tcPr>
+          <w:p>
+            <w:pPr>
+              <w:keepNext/>
+              <w:spacing w:after="0" w:before="0"/>
+            </w:pPr>
+            <w:r>
+              <w:rPr>
+                <w:sz w:val="20"/>
+                <w:szCs w:val="20"/>
+              </w:rPr>
+              <w:t xml:space="preserve">2.3</w:t>
+            </w:r>
+          </w:p>
+        </w:tc>
+      </w:tr>
+      <w:tr>
+        <w:trPr>
+          <w:cantSplit/>
+        </w:trPr>
+        <w:tc>
+          <w:tcPr>
+            <w:tcW w:type="dxa" w:w="1800"/>
+            <w:shd w:fill="F2F2F2" w:color="auto" w:val="clear"/>
+            <w:tcMar>
+              <w:top w:type="dxa" w:w="70"/>
+              <w:left w:type="dxa" w:w="100"/>
+              <w:bottom w:type="dxa" w:w="70"/>
+              <w:right w:type="dxa" w:w="100"/>
+            </w:tcMar>
+          </w:tcPr>
+          <w:p>
+            <w:pPr>
+              <w:keepNext/>
+              <w:spacing w:after="0"/>
+            </w:pPr>
+            <w:r>
+              <w:rPr>
+                <w:b/>
+                <w:bCs/>
+                <w:color w:val="404040"/>
+                <w:sz w:val="20"/>
+                <w:szCs w:val="20"/>
+              </w:rPr>
+              <w:t xml:space="preserve">Decisión</w:t>
+            </w:r>
+          </w:p>
+        </w:tc>
+        <w:tc>
+          <w:tcPr>
+            <w:tcW w:type="dxa" w:w="7226"/>
+            <w:tcMar>
+              <w:top w:type="dxa" w:w="70"/>
+              <w:left w:type="dxa" w:w="100"/>
+              <w:bottom w:type="dxa" w:w="70"/>
+              <w:right w:type="dxa" w:w="100"/>
+            </w:tcMar>
+          </w:tcPr>
+          <w:p>
+            <w:pPr>
+              <w:keepNext/>
+              <w:spacing w:after="0" w:before="0"/>
+            </w:pPr>
+            <w:r>
+              <w:rPr>
+                <w:sz w:val="20"/>
+                <w:szCs w:val="20"/>
+              </w:rPr>
+              <w:t xml:space="preserve">La validación temporal interna (</w:t>
+            </w:r>
+            <w:hyperlink w:history="1" w:anchor="E_D37">
+              <w:r>
+                <w:rPr>
+                  <w:color w:val="0563C1"/>
+                  <w:sz w:val="20"/>
+                  <w:szCs w:val="20"/>
+                  <w:u w:val="single"/>
+                </w:rPr>
+                <w:t xml:space="preserve">D37</w:t>
+              </w:r>
+            </w:hyperlink>
+            <w:r>
+              <w:rPr>
+                <w:sz w:val="20"/>
+                <w:szCs w:val="20"/>
+              </w:rPr>
+              <w:t xml:space="preserve">) se informa de tres maneras: con todos los casos de estudio de evaluación (2023 y 2024), solo con los de pacientes nuevos, cuyo identificador no tiene ningún egreso en 2021 ni en 2022, y solo con los de pacientes ya vistos, que sí lo tienen. Cuenta cualquier egreso, sea o no caso de estudio (parámetro </w:t>
+            </w:r>
+            <w:r>
+              <w:rPr>
+                <w:rFonts w:ascii="Consolas" w:cs="Consolas" w:eastAsia="Consolas" w:hAnsi="Consolas"/>
+                <w:sz w:val="18"/>
+                <w:szCs w:val="18"/>
+                <w:shd w:fill="F2F2F2" w:color="auto" w:val="clear"/>
+              </w:rPr>
+              <w:t xml:space="preserve">paciente_visto_egresos</w:t>
+            </w:r>
+            <w:r>
+              <w:rPr>
+                <w:sz w:val="20"/>
+                <w:szCs w:val="20"/>
+              </w:rPr>
+              <w:t xml:space="preserve"> = TODOS). El script 13 deja los grupos fijados en </w:t>
+            </w:r>
+            <w:r>
+              <w:rPr>
+                <w:rFonts w:ascii="Consolas" w:cs="Consolas" w:eastAsia="Consolas" w:hAnsi="Consolas"/>
+                <w:sz w:val="18"/>
+                <w:szCs w:val="18"/>
+                <w:shd w:fill="F2F2F2" w:color="auto" w:val="clear"/>
+              </w:rPr>
+              <w:t xml:space="preserve">data/processed/validacion_temporal.parquet</w:t>
+            </w:r>
+            <w:r>
+              <w:rPr>
+                <w:sz w:val="20"/>
+                <w:szCs w:val="20"/>
+              </w:rPr>
+              <w:t xml:space="preserve">, para que todos los modelos se evalúen con los mismos; lee solo el conjunto de desarrollo.</w:t>
+            </w:r>
+          </w:p>
+        </w:tc>
+      </w:tr>
+      <w:tr>
+        <w:trPr>
+          <w:cantSplit/>
+        </w:trPr>
+        <w:tc>
+          <w:tcPr>
+            <w:tcW w:type="dxa" w:w="1800"/>
+            <w:shd w:fill="F2F2F2" w:color="auto" w:val="clear"/>
+            <w:tcMar>
+              <w:top w:type="dxa" w:w="70"/>
+              <w:left w:type="dxa" w:w="100"/>
+              <w:bottom w:type="dxa" w:w="70"/>
+              <w:right w:type="dxa" w:w="100"/>
+            </w:tcMar>
+          </w:tcPr>
+          <w:p>
+            <w:pPr>
+              <w:keepNext/>
+              <w:spacing w:after="0"/>
+            </w:pPr>
+            <w:r>
+              <w:rPr>
+                <w:b/>
+                <w:bCs/>
+                <w:color w:val="404040"/>
+                <w:sz w:val="20"/>
+                <w:szCs w:val="20"/>
+              </w:rPr>
+              <w:t xml:space="preserve">Fundamento</w:t>
+            </w:r>
+          </w:p>
+        </w:tc>
+        <w:tc>
+          <w:tcPr>
+            <w:tcW w:type="dxa" w:w="7226"/>
+            <w:tcMar>
+              <w:top w:type="dxa" w:w="70"/>
+              <w:left w:type="dxa" w:w="100"/>
+              <w:bottom w:type="dxa" w:w="70"/>
+              <w:right w:type="dxa" w:w="100"/>
+            </w:tcMar>
+          </w:tcPr>
+          <w:p>
+            <w:pPr>
+              <w:keepNext/>
+              <w:spacing w:after="0" w:before="0"/>
+            </w:pPr>
+            <w:r>
+              <w:rPr>
+                <w:sz w:val="20"/>
+                <w:szCs w:val="20"/>
+              </w:rPr>
+              <w:t xml:space="preserve">Revisión del profesor guía del 13 de octubre de 2026 (punto 2.2). La validación cruzada agrupada por paciente mide el desempeño en pacientes que el modelo no vio. La temporal no: un paciente del bloque B con egresos en 2021 o 2022 y también en 2023 o 2024 está a la vez en el entrenamiento y en la evaluación. No es un error, porque al aplicar el modelo también llegarán pacientes que ya estuvieron hospitalizados, pero mezcla dos preguntas: como el reingreso depende mucho de cada paciente, en los ya vistos el desempeño será mejor por razones que no se trasladan a pacientes nuevos.</w:t>
+            </w:r>
+          </w:p>
+        </w:tc>
+      </w:tr>
+      <w:tr>
+        <w:trPr>
+          <w:cantSplit/>
+        </w:trPr>
+        <w:tc>
+          <w:tcPr>
+            <w:tcW w:type="dxa" w:w="1800"/>
+            <w:shd w:fill="F2F2F2" w:color="auto" w:val="clear"/>
+            <w:tcMar>
+              <w:top w:type="dxa" w:w="70"/>
+              <w:left w:type="dxa" w:w="100"/>
+              <w:bottom w:type="dxa" w:w="70"/>
+              <w:right w:type="dxa" w:w="100"/>
+            </w:tcMar>
+          </w:tcPr>
+          <w:p>
+            <w:pPr>
+              <w:keepNext/>
+              <w:spacing w:after="0"/>
+            </w:pPr>
+            <w:r>
+              <w:rPr>
+                <w:b/>
+                <w:bCs/>
+                <w:color w:val="404040"/>
+                <w:sz w:val="20"/>
+                <w:szCs w:val="20"/>
+              </w:rPr>
+              <w:t xml:space="preserve">Resultado</w:t>
+            </w:r>
+          </w:p>
+        </w:tc>
+        <w:tc>
+          <w:tcPr>
+            <w:tcW w:type="dxa" w:w="7226"/>
+            <w:tcMar>
+              <w:top w:type="dxa" w:w="70"/>
+              <w:left w:type="dxa" w:w="100"/>
+              <w:bottom w:type="dxa" w:w="70"/>
+              <w:right w:type="dxa" w:w="100"/>
+            </w:tcMar>
+          </w:tcPr>
+          <w:tbl>
+            <w:tblPr>
+              <w:tblW w:type="dxa" w:w="7026"/>
+              <w:tblBorders>
+                <w:top w:val="single" w:color="BFBFBF" w:sz="4"/>
+                <w:left w:val="single" w:color="BFBFBF" w:sz="4"/>
+                <w:bottom w:val="single" w:color="BFBFBF" w:sz="4"/>
+                <w:right w:val="single" w:color="BFBFBF" w:sz="4"/>
+                <w:insideH w:val="single" w:color="BFBFBF" w:sz="4"/>
+                <w:insideV w:val="single" w:color="BFBFBF" w:sz="4"/>
+              </w:tblBorders>
+              <w:tblLayout w:type="fixed"/>
+            </w:tblPr>
+            <w:tblGrid>
+              <w:gridCol w:w="1216"/>
+              <w:gridCol w:w="885"/>
+              <w:gridCol w:w="885"/>
+              <w:gridCol w:w="802"/>
+              <w:gridCol w:w="1133"/>
+              <w:gridCol w:w="885"/>
+              <w:gridCol w:w="1220"/>
+            </w:tblGrid>
+            <w:tr>
+              <w:trPr>
+                <w:cantSplit/>
+                <w:tblHeader/>
+              </w:trPr>
+              <w:tc>
+                <w:tcPr>
+                  <w:tcW w:type="dxa" w:w="1216"/>
+                  <w:shd w:fill="D9E2F3" w:color="auto" w:val="clear"/>
+                  <w:tcMar>
+                    <w:top w:type="dxa" w:w="70"/>
+                    <w:left w:type="dxa" w:w="100"/>
+                    <w:bottom w:type="dxa" w:w="70"/>
+                    <w:right w:type="dxa" w:w="100"/>
+                  </w:tcMar>
+                  <w:vAlign w:val="center"/>
+                </w:tcPr>
+                <w:p>
+                  <w:pPr>
+                    <w:spacing w:after="0"/>
+                  </w:pPr>
+                  <w:r>
+                    <w:rPr>
+                      <w:b/>
+                      <w:bCs/>
+                      <w:sz w:val="18"/>
+                      <w:szCs w:val="18"/>
+                    </w:rPr>
+                    <w:t xml:space="preserve">Grupo (conjunto de desarrollo)</w:t>
+                  </w:r>
+                </w:p>
+              </w:tc>
+              <w:tc>
+                <w:tcPr>
+                  <w:tcW w:type="dxa" w:w="885"/>
+                  <w:shd w:fill="D9E2F3" w:color="auto" w:val="clear"/>
+                  <w:tcMar>
+                    <w:top w:type="dxa" w:w="70"/>
+                    <w:left w:type="dxa" w:w="100"/>
+                    <w:bottom w:type="dxa" w:w="70"/>
+                    <w:right w:type="dxa" w:w="100"/>
+                  </w:tcMar>
+                  <w:vAlign w:val="center"/>
+                </w:tcPr>
+                <w:p>
+                  <w:pPr>
+                    <w:spacing w:after="0"/>
+                  </w:pPr>
+                  <w:r>
+                    <w:rPr>
+                      <w:b/>
+                      <w:bCs/>
+                      <w:sz w:val="18"/>
+                      <w:szCs w:val="18"/>
+                    </w:rPr>
+                    <w:t xml:space="preserve">Casos de estudio</w:t>
+                  </w:r>
+                </w:p>
+              </w:tc>
+              <w:tc>
+                <w:tcPr>
+                  <w:tcW w:type="dxa" w:w="885"/>
+                  <w:shd w:fill="D9E2F3" w:color="auto" w:val="clear"/>
+                  <w:tcMar>
+                    <w:top w:type="dxa" w:w="70"/>
+                    <w:left w:type="dxa" w:w="100"/>
+                    <w:bottom w:type="dxa" w:w="70"/>
+                    <w:right w:type="dxa" w:w="100"/>
+                  </w:tcMar>
+                  <w:vAlign w:val="center"/>
+                </w:tcPr>
+                <w:p>
+                  <w:pPr>
+                    <w:spacing w:after="0"/>
+                  </w:pPr>
+                  <w:r>
+                    <w:rPr>
+                      <w:b/>
+                      <w:bCs/>
+                      <w:sz w:val="18"/>
+                      <w:szCs w:val="18"/>
+                    </w:rPr>
+                    <w:t xml:space="preserve">Pacientes</w:t>
+                  </w:r>
+                </w:p>
+              </w:tc>
+              <w:tc>
+                <w:tcPr>
+                  <w:tcW w:type="dxa" w:w="802"/>
+                  <w:shd w:fill="D9E2F3" w:color="auto" w:val="clear"/>
+                  <w:tcMar>
+                    <w:top w:type="dxa" w:w="70"/>
+                    <w:left w:type="dxa" w:w="100"/>
+                    <w:bottom w:type="dxa" w:w="70"/>
+                    <w:right w:type="dxa" w:w="100"/>
+                  </w:tcMar>
+                  <w:vAlign w:val="center"/>
+                </w:tcPr>
+                <w:p>
+                  <w:pPr>
+                    <w:spacing w:after="0"/>
+                  </w:pPr>
+                  <w:r>
+                    <w:rPr>
+                      <w:rFonts w:ascii="Consolas" w:cs="Consolas" w:eastAsia="Consolas" w:hAnsi="Consolas"/>
+                      <w:b/>
+                      <w:bCs/>
+                      <w:sz w:val="16"/>
+                      <w:szCs w:val="16"/>
+                      <w:shd w:fill="F2F2F2" w:color="auto" w:val="clear"/>
+                    </w:rPr>
+                    <w:t xml:space="preserve">REING_7D</w:t>
+                  </w:r>
+                </w:p>
+              </w:tc>
+              <w:tc>
+                <w:tcPr>
+                  <w:tcW w:type="dxa" w:w="1133"/>
+                  <w:shd w:fill="D9E2F3" w:color="auto" w:val="clear"/>
+                  <w:tcMar>
+                    <w:top w:type="dxa" w:w="70"/>
+                    <w:left w:type="dxa" w:w="100"/>
+                    <w:bottom w:type="dxa" w:w="70"/>
+                    <w:right w:type="dxa" w:w="100"/>
+                  </w:tcMar>
+                  <w:vAlign w:val="center"/>
+                </w:tcPr>
+                <w:p>
+                  <w:pPr>
+                    <w:spacing w:after="0"/>
+                  </w:pPr>
+                  <w:r>
+                    <w:rPr>
+                      <w:rFonts w:ascii="Consolas" w:cs="Consolas" w:eastAsia="Consolas" w:hAnsi="Consolas"/>
+                      <w:b/>
+                      <w:bCs/>
+                      <w:sz w:val="16"/>
+                      <w:szCs w:val="16"/>
+                      <w:shd w:fill="F2F2F2" w:color="auto" w:val="clear"/>
+                    </w:rPr>
+                    <w:t xml:space="preserve">REING_7D_CDM</w:t>
+                  </w:r>
+                </w:p>
+              </w:tc>
+              <w:tc>
+                <w:tcPr>
+                  <w:tcW w:type="dxa" w:w="885"/>
+                  <w:shd w:fill="D9E2F3" w:color="auto" w:val="clear"/>
+                  <w:tcMar>
+                    <w:top w:type="dxa" w:w="70"/>
+                    <w:left w:type="dxa" w:w="100"/>
+                    <w:bottom w:type="dxa" w:w="70"/>
+                    <w:right w:type="dxa" w:w="100"/>
+                  </w:tcMar>
+                  <w:vAlign w:val="center"/>
+                </w:tcPr>
+                <w:p>
+                  <w:pPr>
+                    <w:spacing w:after="0"/>
+                  </w:pPr>
+                  <w:r>
+                    <w:rPr>
+                      <w:rFonts w:ascii="Consolas" w:cs="Consolas" w:eastAsia="Consolas" w:hAnsi="Consolas"/>
+                      <w:b/>
+                      <w:bCs/>
+                      <w:sz w:val="16"/>
+                      <w:szCs w:val="16"/>
+                      <w:shd w:fill="F2F2F2" w:color="auto" w:val="clear"/>
+                    </w:rPr>
+                    <w:t xml:space="preserve">REING_30D</w:t>
+                  </w:r>
+                </w:p>
+              </w:tc>
+              <w:tc>
+                <w:tcPr>
+                  <w:tcW w:type="dxa" w:w="1220"/>
+                  <w:shd w:fill="D9E2F3" w:color="auto" w:val="clear"/>
+                  <w:tcMar>
+                    <w:top w:type="dxa" w:w="70"/>
+                    <w:left w:type="dxa" w:w="100"/>
+                    <w:bottom w:type="dxa" w:w="70"/>
+                    <w:right w:type="dxa" w:w="100"/>
+                  </w:tcMar>
+                  <w:vAlign w:val="center"/>
+                </w:tcPr>
+                <w:p>
+                  <w:pPr>
+                    <w:spacing w:after="0"/>
+                  </w:pPr>
+                  <w:r>
+                    <w:rPr>
+                      <w:rFonts w:ascii="Consolas" w:cs="Consolas" w:eastAsia="Consolas" w:hAnsi="Consolas"/>
+                      <w:b/>
+                      <w:bCs/>
+                      <w:sz w:val="16"/>
+                      <w:szCs w:val="16"/>
+                      <w:shd w:fill="F2F2F2" w:color="auto" w:val="clear"/>
+                    </w:rPr>
+                    <w:t xml:space="preserve">REING_30D_CDM</w:t>
+                  </w:r>
+                </w:p>
+              </w:tc>
+            </w:tr>
+            <w:tr>
+              <w:trPr>
+                <w:cantSplit/>
+                <w:tblHeader w:val="off"/>
+              </w:trPr>
+              <w:tc>
+                <w:tcPr>
+                  <w:tcW w:type="dxa" w:w="1216"/>
+                  <w:tcMar>
+                    <w:top w:type="dxa" w:w="70"/>
+                    <w:left w:type="dxa" w:w="100"/>
+                    <w:bottom w:type="dxa" w:w="70"/>
+                    <w:right w:type="dxa" w:w="100"/>
+                  </w:tcMar>
+                  <w:vAlign w:val="center"/>
+                </w:tcPr>
+                <w:p>
+                  <w:pPr>
+                    <w:spacing w:after="0"/>
+                  </w:pPr>
+                  <w:r>
+                    <w:rPr>
+                      <w:sz w:val="18"/>
+                      <w:szCs w:val="18"/>
+                    </w:rPr>
+                    <w:t xml:space="preserve">Entrenamiento (2019–2022)</w:t>
+                  </w:r>
+                </w:p>
+              </w:tc>
+              <w:tc>
+                <w:tcPr>
+                  <w:tcW w:type="dxa" w:w="885"/>
+                  <w:tcMar>
+                    <w:top w:type="dxa" w:w="70"/>
+                    <w:left w:type="dxa" w:w="100"/>
+                    <w:bottom w:type="dxa" w:w="70"/>
+                    <w:right w:type="dxa" w:w="100"/>
+                  </w:tcMar>
+                  <w:vAlign w:val="center"/>
+                </w:tcPr>
+                <w:p>
+                  <w:pPr>
+                    <w:spacing w:after="0"/>
+                  </w:pPr>
+                  <w:r>
+                    <w:rPr>
+                      <w:sz w:val="18"/>
+                      <w:szCs w:val="18"/>
+                    </w:rPr>
+                    <w:t xml:space="preserve">2.168.337</w:t>
+                  </w:r>
+                </w:p>
+              </w:tc>
+              <w:tc>
+                <w:tcPr>
+                  <w:tcW w:type="dxa" w:w="885"/>
+                  <w:tcMar>
+                    <w:top w:type="dxa" w:w="70"/>
+                    <w:left w:type="dxa" w:w="100"/>
+                    <w:bottom w:type="dxa" w:w="70"/>
+                    <w:right w:type="dxa" w:w="100"/>
+                  </w:tcMar>
+                  <w:vAlign w:val="center"/>
+                </w:tcPr>
+                <w:p>
+                  <w:pPr>
+                    <w:spacing w:after="0"/>
+                  </w:pPr>
+                  <w:r>
+                    <w:rPr>
+                      <w:sz w:val="18"/>
+                      <w:szCs w:val="18"/>
+                    </w:rPr>
+                    <w:t xml:space="preserve">1.732.822</w:t>
+                  </w:r>
+                </w:p>
+              </w:tc>
+              <w:tc>
+                <w:tcPr>
+                  <w:tcW w:type="dxa" w:w="802"/>
+                  <w:tcMar>
+                    <w:top w:type="dxa" w:w="70"/>
+                    <w:left w:type="dxa" w:w="100"/>
+                    <w:bottom w:type="dxa" w:w="70"/>
+                    <w:right w:type="dxa" w:w="100"/>
+                  </w:tcMar>
+                  <w:vAlign w:val="center"/>
+                </w:tcPr>
+                <w:p>
+                  <w:pPr>
+                    <w:spacing w:after="0"/>
+                  </w:pPr>
+                  <w:r>
+                    <w:rPr>
+                      <w:sz w:val="18"/>
+                      <w:szCs w:val="18"/>
+                    </w:rPr>
+                    <w:t xml:space="preserve">2,00 %</w:t>
+                  </w:r>
+                </w:p>
+              </w:tc>
+              <w:tc>
+                <w:tcPr>
+                  <w:tcW w:type="dxa" w:w="1133"/>
+                  <w:tcMar>
+                    <w:top w:type="dxa" w:w="70"/>
+                    <w:left w:type="dxa" w:w="100"/>
+                    <w:bottom w:type="dxa" w:w="70"/>
+                    <w:right w:type="dxa" w:w="100"/>
+                  </w:tcMar>
+                  <w:vAlign w:val="center"/>
+                </w:tcPr>
+                <w:p>
+                  <w:pPr>
+                    <w:spacing w:after="0"/>
+                  </w:pPr>
+                  <w:r>
+                    <w:rPr>
+                      <w:sz w:val="18"/>
+                      <w:szCs w:val="18"/>
+                    </w:rPr>
+                    <w:t xml:space="preserve">1,23 %</w:t>
+                  </w:r>
+                </w:p>
+              </w:tc>
+              <w:tc>
+                <w:tcPr>
+                  <w:tcW w:type="dxa" w:w="885"/>
+                  <w:tcMar>
+                    <w:top w:type="dxa" w:w="70"/>
+                    <w:left w:type="dxa" w:w="100"/>
+                    <w:bottom w:type="dxa" w:w="70"/>
+                    <w:right w:type="dxa" w:w="100"/>
+                  </w:tcMar>
+                  <w:vAlign w:val="center"/>
+                </w:tcPr>
+                <w:p>
+                  <w:pPr>
+                    <w:spacing w:after="0"/>
+                  </w:pPr>
+                  <w:r>
+                    <w:rPr>
+                      <w:sz w:val="18"/>
+                      <w:szCs w:val="18"/>
+                    </w:rPr>
+                    <w:t xml:space="preserve">5,69 %</w:t>
+                  </w:r>
+                </w:p>
+              </w:tc>
+              <w:tc>
+                <w:tcPr>
+                  <w:tcW w:type="dxa" w:w="1220"/>
+                  <w:tcMar>
+                    <w:top w:type="dxa" w:w="70"/>
+                    <w:left w:type="dxa" w:w="100"/>
+                    <w:bottom w:type="dxa" w:w="70"/>
+                    <w:right w:type="dxa" w:w="100"/>
+                  </w:tcMar>
+                  <w:vAlign w:val="center"/>
+                </w:tcPr>
+                <w:p>
+                  <w:pPr>
+                    <w:spacing w:after="0"/>
+                  </w:pPr>
+                  <w:r>
+                    <w:rPr>
+                      <w:sz w:val="18"/>
+                      <w:szCs w:val="18"/>
+                    </w:rPr>
+                    <w:t xml:space="preserve">3,45 %</w:t>
+                  </w:r>
+                </w:p>
+              </w:tc>
+            </w:tr>
+            <w:tr>
+              <w:trPr>
+                <w:cantSplit/>
+                <w:tblHeader w:val="off"/>
+              </w:trPr>
+              <w:tc>
+                <w:tcPr>
+                  <w:tcW w:type="dxa" w:w="1216"/>
+                  <w:tcMar>
+                    <w:top w:type="dxa" w:w="70"/>
+                    <w:left w:type="dxa" w:w="100"/>
+                    <w:bottom w:type="dxa" w:w="70"/>
+                    <w:right w:type="dxa" w:w="100"/>
+                  </w:tcMar>
+                  <w:vAlign w:val="center"/>
+                </w:tcPr>
+                <w:p>
+                  <w:pPr>
+                    <w:spacing w:after="0"/>
+                  </w:pPr>
+                  <w:r>
+                    <w:rPr>
+                      <w:sz w:val="18"/>
+                      <w:szCs w:val="18"/>
+                    </w:rPr>
+                    <w:t xml:space="preserve">Evaluación (2023–2024): todos los casos</w:t>
+                  </w:r>
+                </w:p>
+              </w:tc>
+              <w:tc>
+                <w:tcPr>
+                  <w:tcW w:type="dxa" w:w="885"/>
+                  <w:tcMar>
+                    <w:top w:type="dxa" w:w="70"/>
+                    <w:left w:type="dxa" w:w="100"/>
+                    <w:bottom w:type="dxa" w:w="70"/>
+                    <w:right w:type="dxa" w:w="100"/>
+                  </w:tcMar>
+                  <w:vAlign w:val="center"/>
+                </w:tcPr>
+                <w:p>
+                  <w:pPr>
+                    <w:spacing w:after="0"/>
+                  </w:pPr>
+                  <w:r>
+                    <w:rPr>
+                      <w:sz w:val="18"/>
+                      <w:szCs w:val="18"/>
+                    </w:rPr>
+                    <w:t xml:space="preserve">1.185.781</w:t>
+                  </w:r>
+                </w:p>
+              </w:tc>
+              <w:tc>
+                <w:tcPr>
+                  <w:tcW w:type="dxa" w:w="885"/>
+                  <w:tcMar>
+                    <w:top w:type="dxa" w:w="70"/>
+                    <w:left w:type="dxa" w:w="100"/>
+                    <w:bottom w:type="dxa" w:w="70"/>
+                    <w:right w:type="dxa" w:w="100"/>
+                  </w:tcMar>
+                  <w:vAlign w:val="center"/>
+                </w:tcPr>
+                <w:p>
+                  <w:pPr>
+                    <w:spacing w:after="0"/>
+                  </w:pPr>
+                  <w:r>
+                    <w:rPr>
+                      <w:sz w:val="18"/>
+                      <w:szCs w:val="18"/>
+                    </w:rPr>
+                    <w:t xml:space="preserve">915.896</w:t>
+                  </w:r>
+                </w:p>
+              </w:tc>
+              <w:tc>
+                <w:tcPr>
+                  <w:tcW w:type="dxa" w:w="802"/>
+                  <w:tcMar>
+                    <w:top w:type="dxa" w:w="70"/>
+                    <w:left w:type="dxa" w:w="100"/>
+                    <w:bottom w:type="dxa" w:w="70"/>
+                    <w:right w:type="dxa" w:w="100"/>
+                  </w:tcMar>
+                  <w:vAlign w:val="center"/>
+                </w:tcPr>
+                <w:p>
+                  <w:pPr>
+                    <w:spacing w:after="0"/>
+                  </w:pPr>
+                  <w:r>
+                    <w:rPr>
+                      <w:sz w:val="18"/>
+                      <w:szCs w:val="18"/>
+                    </w:rPr>
+                    <w:t xml:space="preserve">2,18 %</w:t>
+                  </w:r>
+                </w:p>
+              </w:tc>
+              <w:tc>
+                <w:tcPr>
+                  <w:tcW w:type="dxa" w:w="1133"/>
+                  <w:tcMar>
+                    <w:top w:type="dxa" w:w="70"/>
+                    <w:left w:type="dxa" w:w="100"/>
+                    <w:bottom w:type="dxa" w:w="70"/>
+                    <w:right w:type="dxa" w:w="100"/>
+                  </w:tcMar>
+                  <w:vAlign w:val="center"/>
+                </w:tcPr>
+                <w:p>
+                  <w:pPr>
+                    <w:spacing w:after="0"/>
+                  </w:pPr>
+                  <w:r>
+                    <w:rPr>
+                      <w:sz w:val="18"/>
+                      <w:szCs w:val="18"/>
+                    </w:rPr>
+                    <w:t xml:space="preserve">1,32 %</w:t>
+                  </w:r>
+                </w:p>
+              </w:tc>
+              <w:tc>
+                <w:tcPr>
+                  <w:tcW w:type="dxa" w:w="885"/>
+                  <w:tcMar>
+                    <w:top w:type="dxa" w:w="70"/>
+                    <w:left w:type="dxa" w:w="100"/>
+                    <w:bottom w:type="dxa" w:w="70"/>
+                    <w:right w:type="dxa" w:w="100"/>
+                  </w:tcMar>
+                  <w:vAlign w:val="center"/>
+                </w:tcPr>
+                <w:p>
+                  <w:pPr>
+                    <w:spacing w:after="0"/>
+                  </w:pPr>
+                  <w:r>
+                    <w:rPr>
+                      <w:sz w:val="18"/>
+                      <w:szCs w:val="18"/>
+                    </w:rPr>
+                    <w:t xml:space="preserve">6,28 %</w:t>
+                  </w:r>
+                </w:p>
+              </w:tc>
+              <w:tc>
+                <w:tcPr>
+                  <w:tcW w:type="dxa" w:w="1220"/>
+                  <w:tcMar>
+                    <w:top w:type="dxa" w:w="70"/>
+                    <w:left w:type="dxa" w:w="100"/>
+                    <w:bottom w:type="dxa" w:w="70"/>
+                    <w:right w:type="dxa" w:w="100"/>
+                  </w:tcMar>
+                  <w:vAlign w:val="center"/>
+                </w:tcPr>
+                <w:p>
+                  <w:pPr>
+                    <w:spacing w:after="0"/>
+                  </w:pPr>
+                  <w:r>
+                    <w:rPr>
+                      <w:sz w:val="18"/>
+                      <w:szCs w:val="18"/>
+                    </w:rPr>
+                    <w:t xml:space="preserve">3,74 %</w:t>
+                  </w:r>
+                </w:p>
+              </w:tc>
+            </w:tr>
+            <w:tr>
+              <w:trPr>
+                <w:cantSplit/>
+                <w:tblHeader w:val="off"/>
+              </w:trPr>
+              <w:tc>
+                <w:tcPr>
+                  <w:tcW w:type="dxa" w:w="1216"/>
+                  <w:tcMar>
+                    <w:top w:type="dxa" w:w="70"/>
+                    <w:left w:type="dxa" w:w="100"/>
+                    <w:bottom w:type="dxa" w:w="70"/>
+                    <w:right w:type="dxa" w:w="100"/>
+                  </w:tcMar>
+                  <w:vAlign w:val="center"/>
+                </w:tcPr>
+                <w:p>
+                  <w:pPr>
+                    <w:spacing w:after="0"/>
+                  </w:pPr>
+                  <w:r>
+                    <w:rPr>
+                      <w:sz w:val="18"/>
+                      <w:szCs w:val="18"/>
+                    </w:rPr>
+                    <w:t xml:space="preserve">Evaluación: pacientes nuevos</w:t>
+                  </w:r>
+                </w:p>
+              </w:tc>
+              <w:tc>
+                <w:tcPr>
+                  <w:tcW w:type="dxa" w:w="885"/>
+                  <w:tcMar>
+                    <w:top w:type="dxa" w:w="70"/>
+                    <w:left w:type="dxa" w:w="100"/>
+                    <w:bottom w:type="dxa" w:w="70"/>
+                    <w:right w:type="dxa" w:w="100"/>
+                  </w:tcMar>
+                  <w:vAlign w:val="center"/>
+                </w:tcPr>
+                <w:p>
+                  <w:pPr>
+                    <w:spacing w:after="0"/>
+                  </w:pPr>
+                  <w:r>
+                    <w:rPr>
+                      <w:sz w:val="18"/>
+                      <w:szCs w:val="18"/>
+                    </w:rPr>
+                    <w:t xml:space="preserve">943.588 (79,6 %)</w:t>
+                  </w:r>
+                </w:p>
+              </w:tc>
+              <w:tc>
+                <w:tcPr>
+                  <w:tcW w:type="dxa" w:w="885"/>
+                  <w:tcMar>
+                    <w:top w:type="dxa" w:w="70"/>
+                    <w:left w:type="dxa" w:w="100"/>
+                    <w:bottom w:type="dxa" w:w="70"/>
+                    <w:right w:type="dxa" w:w="100"/>
+                  </w:tcMar>
+                  <w:vAlign w:val="center"/>
+                </w:tcPr>
+                <w:p>
+                  <w:pPr>
+                    <w:spacing w:after="0"/>
+                  </w:pPr>
+                  <w:r>
+                    <w:rPr>
+                      <w:sz w:val="18"/>
+                      <w:szCs w:val="18"/>
+                    </w:rPr>
+                    <w:t xml:space="preserve">758.487</w:t>
+                  </w:r>
+                </w:p>
+              </w:tc>
+              <w:tc>
+                <w:tcPr>
+                  <w:tcW w:type="dxa" w:w="802"/>
+                  <w:tcMar>
+                    <w:top w:type="dxa" w:w="70"/>
+                    <w:left w:type="dxa" w:w="100"/>
+                    <w:bottom w:type="dxa" w:w="70"/>
+                    <w:right w:type="dxa" w:w="100"/>
+                  </w:tcMar>
+                  <w:vAlign w:val="center"/>
+                </w:tcPr>
+                <w:p>
+                  <w:pPr>
+                    <w:spacing w:after="0"/>
+                  </w:pPr>
+                  <w:r>
+                    <w:rPr>
+                      <w:sz w:val="18"/>
+                      <w:szCs w:val="18"/>
+                    </w:rPr>
+                    <w:t xml:space="preserve">1,96 %</w:t>
+                  </w:r>
+                </w:p>
+              </w:tc>
+              <w:tc>
+                <w:tcPr>
+                  <w:tcW w:type="dxa" w:w="1133"/>
+                  <w:tcMar>
+                    <w:top w:type="dxa" w:w="70"/>
+                    <w:left w:type="dxa" w:w="100"/>
+                    <w:bottom w:type="dxa" w:w="70"/>
+                    <w:right w:type="dxa" w:w="100"/>
+                  </w:tcMar>
+                  <w:vAlign w:val="center"/>
+                </w:tcPr>
+                <w:p>
+                  <w:pPr>
+                    <w:spacing w:after="0"/>
+                  </w:pPr>
+                  <w:r>
+                    <w:rPr>
+                      <w:sz w:val="18"/>
+                      <w:szCs w:val="18"/>
+                    </w:rPr>
+                    <w:t xml:space="preserve">1,22 %</w:t>
+                  </w:r>
+                </w:p>
+              </w:tc>
+              <w:tc>
+                <w:tcPr>
+                  <w:tcW w:type="dxa" w:w="885"/>
+                  <w:tcMar>
+                    <w:top w:type="dxa" w:w="70"/>
+                    <w:left w:type="dxa" w:w="100"/>
+                    <w:bottom w:type="dxa" w:w="70"/>
+                    <w:right w:type="dxa" w:w="100"/>
+                  </w:tcMar>
+                  <w:vAlign w:val="center"/>
+                </w:tcPr>
+                <w:p>
+                  <w:pPr>
+                    <w:spacing w:after="0"/>
+                  </w:pPr>
+                  <w:r>
+                    <w:rPr>
+                      <w:sz w:val="18"/>
+                      <w:szCs w:val="18"/>
+                    </w:rPr>
+                    <w:t xml:space="preserve">5,42 %</w:t>
+                  </w:r>
+                </w:p>
+              </w:tc>
+              <w:tc>
+                <w:tcPr>
+                  <w:tcW w:type="dxa" w:w="1220"/>
+                  <w:tcMar>
+                    <w:top w:type="dxa" w:w="70"/>
+                    <w:left w:type="dxa" w:w="100"/>
+                    <w:bottom w:type="dxa" w:w="70"/>
+                    <w:right w:type="dxa" w:w="100"/>
+                  </w:tcMar>
+                  <w:vAlign w:val="center"/>
+                </w:tcPr>
+                <w:p>
+                  <w:pPr>
+                    <w:spacing w:after="0"/>
+                  </w:pPr>
+                  <w:r>
+                    <w:rPr>
+                      <w:sz w:val="18"/>
+                      <w:szCs w:val="18"/>
+                    </w:rPr>
+                    <w:t xml:space="preserve">3,30 %</w:t>
+                  </w:r>
+                </w:p>
+              </w:tc>
+            </w:tr>
+            <w:tr>
+              <w:trPr>
+                <w:cantSplit/>
+                <w:tblHeader w:val="off"/>
+              </w:trPr>
+              <w:tc>
+                <w:tcPr>
+                  <w:tcW w:type="dxa" w:w="1216"/>
+                  <w:tcMar>
+                    <w:top w:type="dxa" w:w="70"/>
+                    <w:left w:type="dxa" w:w="100"/>
+                    <w:bottom w:type="dxa" w:w="70"/>
+                    <w:right w:type="dxa" w:w="100"/>
+                  </w:tcMar>
+                  <w:vAlign w:val="center"/>
+                </w:tcPr>
+                <w:p>
+                  <w:pPr>
+                    <w:spacing w:after="0"/>
+                  </w:pPr>
+                  <w:r>
+                    <w:rPr>
+                      <w:sz w:val="18"/>
+                      <w:szCs w:val="18"/>
+                    </w:rPr>
+                    <w:t xml:space="preserve">Evaluación: pacientes ya vistos</w:t>
+                  </w:r>
+                </w:p>
+              </w:tc>
+              <w:tc>
+                <w:tcPr>
+                  <w:tcW w:type="dxa" w:w="885"/>
+                  <w:tcMar>
+                    <w:top w:type="dxa" w:w="70"/>
+                    <w:left w:type="dxa" w:w="100"/>
+                    <w:bottom w:type="dxa" w:w="70"/>
+                    <w:right w:type="dxa" w:w="100"/>
+                  </w:tcMar>
+                  <w:vAlign w:val="center"/>
+                </w:tcPr>
+                <w:p>
+                  <w:pPr>
+                    <w:spacing w:after="0"/>
+                  </w:pPr>
+                  <w:r>
+                    <w:rPr>
+                      <w:sz w:val="18"/>
+                      <w:szCs w:val="18"/>
+                    </w:rPr>
+                    <w:t xml:space="preserve">242.193 (20,4 %)</w:t>
+                  </w:r>
+                </w:p>
+              </w:tc>
+              <w:tc>
+                <w:tcPr>
+                  <w:tcW w:type="dxa" w:w="885"/>
+                  <w:tcMar>
+                    <w:top w:type="dxa" w:w="70"/>
+                    <w:left w:type="dxa" w:w="100"/>
+                    <w:bottom w:type="dxa" w:w="70"/>
+                    <w:right w:type="dxa" w:w="100"/>
+                  </w:tcMar>
+                  <w:vAlign w:val="center"/>
+                </w:tcPr>
+                <w:p>
+                  <w:pPr>
+                    <w:spacing w:after="0"/>
+                  </w:pPr>
+                  <w:r>
+                    <w:rPr>
+                      <w:sz w:val="18"/>
+                      <w:szCs w:val="18"/>
+                    </w:rPr>
+                    <w:t xml:space="preserve">157.409</w:t>
+                  </w:r>
+                </w:p>
+              </w:tc>
+              <w:tc>
+                <w:tcPr>
+                  <w:tcW w:type="dxa" w:w="802"/>
+                  <w:tcMar>
+                    <w:top w:type="dxa" w:w="70"/>
+                    <w:left w:type="dxa" w:w="100"/>
+                    <w:bottom w:type="dxa" w:w="70"/>
+                    <w:right w:type="dxa" w:w="100"/>
+                  </w:tcMar>
+                  <w:vAlign w:val="center"/>
+                </w:tcPr>
+                <w:p>
+                  <w:pPr>
+                    <w:spacing w:after="0"/>
+                  </w:pPr>
+                  <w:r>
+                    <w:rPr>
+                      <w:sz w:val="18"/>
+                      <w:szCs w:val="18"/>
+                    </w:rPr>
+                    <w:t xml:space="preserve">3,05 %</w:t>
+                  </w:r>
+                </w:p>
+              </w:tc>
+              <w:tc>
+                <w:tcPr>
+                  <w:tcW w:type="dxa" w:w="1133"/>
+                  <w:tcMar>
+                    <w:top w:type="dxa" w:w="70"/>
+                    <w:left w:type="dxa" w:w="100"/>
+                    <w:bottom w:type="dxa" w:w="70"/>
+                    <w:right w:type="dxa" w:w="100"/>
+                  </w:tcMar>
+                  <w:vAlign w:val="center"/>
+                </w:tcPr>
+                <w:p>
+                  <w:pPr>
+                    <w:spacing w:after="0"/>
+                  </w:pPr>
+                  <w:r>
+                    <w:rPr>
+                      <w:sz w:val="18"/>
+                      <w:szCs w:val="18"/>
+                    </w:rPr>
+                    <w:t xml:space="preserve">1,70 %</w:t>
+                  </w:r>
+                </w:p>
+              </w:tc>
+              <w:tc>
+                <w:tcPr>
+                  <w:tcW w:type="dxa" w:w="885"/>
+                  <w:tcMar>
+                    <w:top w:type="dxa" w:w="70"/>
+                    <w:left w:type="dxa" w:w="100"/>
+                    <w:bottom w:type="dxa" w:w="70"/>
+                    <w:right w:type="dxa" w:w="100"/>
+                  </w:tcMar>
+                  <w:vAlign w:val="center"/>
+                </w:tcPr>
+                <w:p>
+                  <w:pPr>
+                    <w:spacing w:after="0"/>
+                  </w:pPr>
+                  <w:r>
+                    <w:rPr>
+                      <w:sz w:val="18"/>
+                      <w:szCs w:val="18"/>
+                    </w:rPr>
+                    <w:t xml:space="preserve">9,65 %</w:t>
+                  </w:r>
+                </w:p>
+              </w:tc>
+              <w:tc>
+                <w:tcPr>
+                  <w:tcW w:type="dxa" w:w="1220"/>
+                  <w:tcMar>
+                    <w:top w:type="dxa" w:w="70"/>
+                    <w:left w:type="dxa" w:w="100"/>
+                    <w:bottom w:type="dxa" w:w="70"/>
+                    <w:right w:type="dxa" w:w="100"/>
+                  </w:tcMar>
+                  <w:vAlign w:val="center"/>
+                </w:tcPr>
+                <w:p>
+                  <w:pPr>
+                    <w:spacing w:after="0"/>
+                  </w:pPr>
+                  <w:r>
+                    <w:rPr>
+                      <w:sz w:val="18"/>
+                      <w:szCs w:val="18"/>
+                    </w:rPr>
+                    <w:t xml:space="preserve">5,34 %</w:t>
+                  </w:r>
+                </w:p>
+              </w:tc>
+            </w:tr>
+          </w:tbl>
+          <w:p>
+            <w:pPr>
+              <w:spacing w:after="0"/>
+            </w:pPr>
+          </w:p>
+        </w:tc>
+      </w:tr>
+      <w:tr>
+        <w:trPr>
+          <w:cantSplit/>
+        </w:trPr>
+        <w:tc>
+          <w:tcPr>
+            <w:tcW w:type="dxa" w:w="1800"/>
+            <w:shd w:fill="F2F2F2" w:color="auto" w:val="clear"/>
+            <w:tcMar>
+              <w:top w:type="dxa" w:w="70"/>
+              <w:left w:type="dxa" w:w="100"/>
+              <w:bottom w:type="dxa" w:w="70"/>
+              <w:right w:type="dxa" w:w="100"/>
+            </w:tcMar>
+          </w:tcPr>
+          <w:p>
+            <w:pPr>
+              <w:keepNext/>
+              <w:spacing w:after="0"/>
+            </w:pPr>
+            <w:r>
+              <w:rPr>
+                <w:b/>
+                <w:bCs/>
+                <w:color w:val="404040"/>
+                <w:sz w:val="20"/>
+                <w:szCs w:val="20"/>
+              </w:rPr>
+              <w:t xml:space="preserve">Interpretación</w:t>
+            </w:r>
+          </w:p>
+        </w:tc>
+        <w:tc>
+          <w:tcPr>
+            <w:tcW w:type="dxa" w:w="7226"/>
+            <w:tcMar>
+              <w:top w:type="dxa" w:w="70"/>
+              <w:left w:type="dxa" w:w="100"/>
+              <w:bottom w:type="dxa" w:w="70"/>
+              <w:right w:type="dxa" w:w="100"/>
+            </w:tcMar>
+          </w:tcPr>
+          <w:p>
+            <w:pPr>
+              <w:keepNext/>
+              <w:spacing w:after="0" w:before="0"/>
+            </w:pPr>
+            <w:r>
+              <w:rPr>
+                <w:sz w:val="20"/>
+                <w:szCs w:val="20"/>
+              </w:rPr>
+              <w:t xml:space="preserve">Los pacientes ya vistos reingresan casi el doble que los nuevos (9,65 % frente a 5,42 % a 30 días), así que el resultado de la validación temporal depende de cuántos haya: separarlos permite distinguir el desempeño en pacientes nuevos del desempeño en pacientes conocidos. En 2023 son el 22,6 % de los casos de evaluación y en 2024, el 18,1 %.</w:t>
+            </w:r>
+          </w:p>
+        </w:tc>
+      </w:tr>
+      <w:tr>
+        <w:trPr>
+          <w:cantSplit/>
+        </w:trPr>
+        <w:tc>
+          <w:tcPr>
+            <w:tcW w:type="dxa" w:w="1800"/>
+            <w:shd w:fill="F2F2F2" w:color="auto" w:val="clear"/>
+            <w:tcMar>
+              <w:top w:type="dxa" w:w="70"/>
+              <w:left w:type="dxa" w:w="100"/>
+              <w:bottom w:type="dxa" w:w="70"/>
+              <w:right w:type="dxa" w:w="100"/>
+            </w:tcMar>
+          </w:tcPr>
+          <w:p>
+            <w:pPr>
+              <w:keepNext/>
+              <w:spacing w:after="0"/>
+            </w:pPr>
+            <w:r>
+              <w:rPr>
+                <w:b/>
+                <w:bCs/>
+                <w:color w:val="404040"/>
+                <w:sz w:val="20"/>
+                <w:szCs w:val="20"/>
+              </w:rPr>
+              <w:t xml:space="preserve">Alcance</w:t>
+            </w:r>
+          </w:p>
+        </w:tc>
+        <w:tc>
+          <w:tcPr>
+            <w:tcW w:type="dxa" w:w="7226"/>
+            <w:tcMar>
+              <w:top w:type="dxa" w:w="70"/>
+              <w:left w:type="dxa" w:w="100"/>
+              <w:bottom w:type="dxa" w:w="70"/>
+              <w:right w:type="dxa" w:w="100"/>
+            </w:tcMar>
+          </w:tcPr>
+          <w:p>
+            <w:pPr>
+              <w:keepNext/>
+              <w:spacing w:after="0" w:before="0"/>
+            </w:pPr>
+            <w:r>
+              <w:rPr>
+                <w:sz w:val="20"/>
+                <w:szCs w:val="20"/>
+              </w:rPr>
+              <w:t xml:space="preserve">La separación vale dentro del bloque 2021–2024. Los egresos de 2019 y 2020 tienen otro identificador (</w:t>
+            </w:r>
+            <w:hyperlink w:history="1" w:anchor="E_H19">
+              <w:r>
+                <w:rPr>
+                  <w:color w:val="0563C1"/>
+                  <w:sz w:val="20"/>
+                  <w:szCs w:val="20"/>
+                  <w:u w:val="single"/>
+                </w:rPr>
+                <w:t xml:space="preserve">H19</w:t>
+              </w:r>
+            </w:hyperlink>
+            <w:r>
+              <w:rPr>
+                <w:sz w:val="20"/>
+                <w:szCs w:val="20"/>
+              </w:rPr>
+              <w:t xml:space="preserve">): un paciente «nuevo» pudo estar hospitalizado en esos años, y los 1.093.656 casos de entrenamiento del bloque A no hacen visto a nadie.</w:t>
+            </w:r>
+          </w:p>
+        </w:tc>
+      </w:tr>
+      <w:tr>
+        <w:trPr>
+          <w:cantSplit/>
+        </w:trPr>
+        <w:tc>
+          <w:tcPr>
+            <w:tcW w:type="dxa" w:w="1800"/>
+            <w:shd w:fill="F2F2F2" w:color="auto" w:val="clear"/>
+            <w:tcMar>
+              <w:top w:type="dxa" w:w="70"/>
+              <w:left w:type="dxa" w:w="100"/>
+              <w:bottom w:type="dxa" w:w="70"/>
+              <w:right w:type="dxa" w:w="100"/>
+            </w:tcMar>
+          </w:tcPr>
+          <w:p>
+            <w:pPr>
+              <w:keepNext/>
+              <w:spacing w:after="0"/>
+            </w:pPr>
+            <w:r>
+              <w:rPr>
+                <w:b/>
+                <w:bCs/>
+                <w:color w:val="404040"/>
+                <w:sz w:val="20"/>
+                <w:szCs w:val="20"/>
+              </w:rPr>
+              <w:t xml:space="preserve">Alternativa</w:t>
+            </w:r>
+          </w:p>
+        </w:tc>
+        <w:tc>
+          <w:tcPr>
+            <w:tcW w:type="dxa" w:w="7226"/>
+            <w:tcMar>
+              <w:top w:type="dxa" w:w="70"/>
+              <w:left w:type="dxa" w:w="100"/>
+              <w:bottom w:type="dxa" w:w="70"/>
+              <w:right w:type="dxa" w:w="100"/>
+            </w:tcMar>
+          </w:tcPr>
+          <w:p>
+            <w:pPr>
+              <w:keepNext/>
+              <w:spacing w:after="0" w:before="0"/>
+            </w:pPr>
+            <w:r>
+              <w:rPr>
+                <w:sz w:val="20"/>
+                <w:szCs w:val="20"/>
+              </w:rPr>
+              <w:t xml:space="preserve">Contar solo los casos de estudio de 2021 y 2022 (</w:t>
+            </w:r>
+            <w:r>
+              <w:rPr>
+                <w:rFonts w:ascii="Consolas" w:cs="Consolas" w:eastAsia="Consolas" w:hAnsi="Consolas"/>
+                <w:sz w:val="18"/>
+                <w:szCs w:val="18"/>
+                <w:shd w:fill="F2F2F2" w:color="auto" w:val="clear"/>
+              </w:rPr>
+              <w:t xml:space="preserve">paciente_visto_egresos</w:t>
+            </w:r>
+            <w:r>
+              <w:rPr>
+                <w:sz w:val="20"/>
+                <w:szCs w:val="20"/>
+              </w:rPr>
+              <w:t xml:space="preserve"> = CASOS): serían 218.041 casos de pacientes ya vistos (18,4 %).</w:t>
+            </w:r>
+          </w:p>
+        </w:tc>
+      </w:tr>
+      <w:tr>
+        <w:trPr>
+          <w:cantSplit/>
+        </w:trPr>
+        <w:tc>
+          <w:tcPr>
+            <w:tcW w:type="dxa" w:w="1800"/>
+            <w:shd w:fill="F2F2F2" w:color="auto" w:val="clear"/>
+            <w:tcMar>
+              <w:top w:type="dxa" w:w="70"/>
+              <w:left w:type="dxa" w:w="100"/>
+              <w:bottom w:type="dxa" w:w="70"/>
+              <w:right w:type="dxa" w:w="100"/>
+            </w:tcMar>
+          </w:tcPr>
+          <w:p>
+            <w:pPr>
+              <w:keepNext/>
+              <w:spacing w:after="0"/>
+            </w:pPr>
+            <w:r>
+              <w:rPr>
+                <w:b/>
+                <w:bCs/>
+                <w:color w:val="404040"/>
+                <w:sz w:val="20"/>
+                <w:szCs w:val="20"/>
+              </w:rPr>
+              <w:t xml:space="preserve">Visto bueno</w:t>
+            </w:r>
+          </w:p>
+        </w:tc>
+        <w:tc>
+          <w:tcPr>
+            <w:tcW w:type="dxa" w:w="7226"/>
+            <w:tcMar>
+              <w:top w:type="dxa" w:w="70"/>
+              <w:left w:type="dxa" w:w="100"/>
+              <w:bottom w:type="dxa" w:w="70"/>
+              <w:right w:type="dxa" w:w="100"/>
+            </w:tcMar>
+          </w:tcPr>
+          <w:p>
+            <w:pPr>
+              <w:keepNext/>
+              <w:spacing w:after="0" w:before="0"/>
+            </w:pPr>
+            <w:r>
+              <w:rPr>
+                <w:sz w:val="20"/>
+                <w:szCs w:val="20"/>
+              </w:rPr>
+              <w:t xml:space="preserve">La persona a cargo de la tesis lo aprobó el 20 de octubre de 2026, por ser lo que indica la revisión.</w:t>
+            </w:r>
+          </w:p>
+        </w:tc>
+      </w:tr>
+      <w:tr>
+        <w:trPr>
+          <w:cantSplit/>
+        </w:trPr>
+        <w:tc>
+          <w:tcPr>
+            <w:tcW w:type="dxa" w:w="1800"/>
+            <w:shd w:fill="F2F2F2" w:color="auto" w:val="clear"/>
+            <w:tcMar>
+              <w:top w:type="dxa" w:w="70"/>
+              <w:left w:type="dxa" w:w="100"/>
+              <w:bottom w:type="dxa" w:w="70"/>
+              <w:right w:type="dxa" w:w="100"/>
+            </w:tcMar>
+          </w:tcPr>
+          <w:p>
+            <w:pPr>
+              <w:keepNext/>
+              <w:spacing w:after="0"/>
+            </w:pPr>
+            <w:r>
+              <w:rPr>
+                <w:b/>
+                <w:bCs/>
+                <w:color w:val="404040"/>
+                <w:sz w:val="20"/>
+                <w:szCs w:val="20"/>
+              </w:rPr>
+              <w:t xml:space="preserve">Evidencia</w:t>
+            </w:r>
+          </w:p>
+        </w:tc>
+        <w:tc>
+          <w:tcPr>
+            <w:tcW w:type="dxa" w:w="7226"/>
+            <w:tcMar>
+              <w:top w:type="dxa" w:w="70"/>
+              <w:left w:type="dxa" w:w="100"/>
+              <w:bottom w:type="dxa" w:w="70"/>
+              <w:right w:type="dxa" w:w="100"/>
+            </w:tcMar>
+          </w:tcPr>
+          <w:p>
+            <w:pPr>
+              <w:keepNext/>
+              <w:spacing w:after="0" w:before="0"/>
+            </w:pPr>
+            <w:r>
+              <w:rPr>
+                <w:rFonts w:ascii="Consolas" w:cs="Consolas" w:eastAsia="Consolas" w:hAnsi="Consolas"/>
+                <w:sz w:val="18"/>
+                <w:szCs w:val="18"/>
+                <w:shd w:fill="F2F2F2" w:color="auto" w:val="clear"/>
+              </w:rPr>
+              <w:t xml:space="preserve">2.3_validacion_particion/scripts/13_validacion_temporal.py</w:t>
+            </w:r>
+            <w:r>
+              <w:rPr>
+                <w:sz w:val="20"/>
+                <w:szCs w:val="20"/>
+              </w:rPr>
+              <w:t xml:space="preserve"> → </w:t>
+            </w:r>
+            <w:r>
+              <w:rPr>
+                <w:rFonts w:ascii="Consolas" w:cs="Consolas" w:eastAsia="Consolas" w:hAnsi="Consolas"/>
+                <w:sz w:val="18"/>
+                <w:szCs w:val="18"/>
+                <w:shd w:fill="F2F2F2" w:color="auto" w:val="clear"/>
+              </w:rPr>
+              <w:t xml:space="preserve">2.3_validacion_particion/reportes/13_validacion_temporal.md</w:t>
+            </w:r>
+            <w:r>
+              <w:rPr>
+                <w:sz w:val="20"/>
+                <w:szCs w:val="20"/>
+              </w:rPr>
+              <w:t xml:space="preserve">; contraste independiente en </w:t>
+            </w:r>
+            <w:r>
+              <w:rPr>
+                <w:rFonts w:ascii="Consolas" w:cs="Consolas" w:eastAsia="Consolas" w:hAnsi="Consolas"/>
+                <w:sz w:val="18"/>
+                <w:szCs w:val="18"/>
+                <w:shd w:fill="F2F2F2" w:color="auto" w:val="clear"/>
+              </w:rPr>
+              <w:t xml:space="preserve">pruebas/verificar_13_validacion_temporal.py</w:t>
+            </w:r>
+            <w:r>
+              <w:rPr>
+                <w:sz w:val="20"/>
+                <w:szCs w:val="20"/>
+              </w:rPr>
+              <w:t xml:space="preserve"> (9 comprobaciones, sin fallas).</w:t>
+            </w:r>
+          </w:p>
+        </w:tc>
+      </w:tr>
+      <w:tr>
+        <w:trPr>
+          <w:cantSplit/>
+        </w:trPr>
+        <w:tc>
+          <w:tcPr>
+            <w:tcW w:type="dxa" w:w="1800"/>
+            <w:shd w:fill="F2F2F2" w:color="auto" w:val="clear"/>
+            <w:tcMar>
+              <w:top w:type="dxa" w:w="70"/>
+              <w:left w:type="dxa" w:w="100"/>
+              <w:bottom w:type="dxa" w:w="70"/>
+              <w:right w:type="dxa" w:w="100"/>
+            </w:tcMar>
+          </w:tcPr>
+          <w:p>
+            <w:pPr>
+              <w:keepNext w:val="false"/>
+              <w:spacing w:after="0"/>
+            </w:pPr>
+            <w:r>
+              <w:rPr>
+                <w:b/>
+                <w:bCs/>
+                <w:color w:val="404040"/>
+                <w:sz w:val="20"/>
+                <w:szCs w:val="20"/>
+              </w:rPr>
+              <w:t xml:space="preserve">Estado</w:t>
+            </w:r>
+          </w:p>
+        </w:tc>
+        <w:tc>
+          <w:tcPr>
+            <w:tcW w:type="dxa" w:w="7226"/>
+            <w:tcMar>
+              <w:top w:type="dxa" w:w="70"/>
+              <w:left w:type="dxa" w:w="100"/>
+              <w:bottom w:type="dxa" w:w="70"/>
+              <w:right w:type="dxa" w:w="100"/>
+            </w:tcMar>
+          </w:tcPr>
+          <w:p>
+            <w:pPr>
+              <w:keepNext w:val="false"/>
+              <w:spacing w:after="0" w:before="0"/>
+            </w:pPr>
+            <w:r>
+              <w:rPr>
+                <w:sz w:val="20"/>
+                <w:szCs w:val="20"/>
+              </w:rPr>
+              <w:t xml:space="preserve">Adoptada, por recomendación del profesor guía.</w:t>
+            </w:r>
+          </w:p>
+        </w:tc>
+      </w:tr>
+    </w:tbl>
+    <w:p>
+      <w:pPr>
+        <w:pStyle w:val="Heading2"/>
+      </w:pPr>
+      <w:bookmarkStart w:name="E_D41" w:id="7"/>
+      <w:r>
+        <w:rPr>
+          <w:color w:val="548235"/>
+        </w:rPr>
+        <w:t xml:space="preserve">D41</w:t>
+      </w:r>
+      <w:bookmarkEnd w:id="7"/>
+      <w:r>
+        <w:t xml:space="preserve"> · Métricas de evaluación, intervalos y recalibración</w:t>
+      </w:r>
+    </w:p>
+    <w:p>
+      <w:pPr>
+        <w:keepNext/>
+        <w:spacing w:after="100"/>
+      </w:pPr>
+      <w:r>
+        <w:rPr>
+          <w:b/>
+          <w:bCs/>
+          <w:color w:val="548235"/>
+          <w:sz w:val="18"/>
+          <w:szCs w:val="18"/>
+        </w:rPr>
+        <w:t xml:space="preserve">Decisión</w:t>
+      </w:r>
+      <w:r>
+        <w:rPr>
+          <w:color w:val="808080"/>
+          <w:sz w:val="18"/>
+          <w:szCs w:val="18"/>
+        </w:rPr>
+        <w:t xml:space="preserve">  ·  20 de octubre de 2026</w:t>
+      </w:r>
+    </w:p>
+    <w:tbl>
+      <w:tblPr>
+        <w:tblW w:type="dxa" w:w="9026"/>
+        <w:tblBorders>
+          <w:top w:val="single" w:color="BFBFBF" w:sz="4"/>
+          <w:left w:val="single" w:color="BFBFBF" w:sz="4"/>
+          <w:bottom w:val="single" w:color="BFBFBF" w:sz="4"/>
+          <w:right w:val="single" w:color="BFBFBF" w:sz="4"/>
+          <w:insideH w:val="single" w:color="BFBFBF" w:sz="4"/>
+          <w:insideV w:val="single" w:color="BFBFBF" w:sz="4"/>
+        </w:tblBorders>
+        <w:tblLayout w:type="fixed"/>
+      </w:tblPr>
+      <w:tblGrid>
+        <w:gridCol w:w="1800"/>
+        <w:gridCol w:w="7226"/>
+      </w:tblGrid>
+      <w:tr>
+        <w:trPr>
+          <w:cantSplit/>
+        </w:trPr>
+        <w:tc>
+          <w:tcPr>
+            <w:tcW w:type="dxa" w:w="1800"/>
+            <w:shd w:fill="F2F2F2" w:color="auto" w:val="clear"/>
+            <w:tcMar>
+              <w:top w:type="dxa" w:w="70"/>
+              <w:left w:type="dxa" w:w="100"/>
+              <w:bottom w:type="dxa" w:w="70"/>
+              <w:right w:type="dxa" w:w="100"/>
+            </w:tcMar>
+          </w:tcPr>
+          <w:p>
+            <w:pPr>
+              <w:keepNext/>
+              <w:spacing w:after="0"/>
+            </w:pPr>
+            <w:r>
+              <w:rPr>
+                <w:b/>
+                <w:bCs/>
+                <w:color w:val="404040"/>
+                <w:sz w:val="20"/>
+                <w:szCs w:val="20"/>
+              </w:rPr>
+              <w:t xml:space="preserve">Actividad</w:t>
+            </w:r>
+          </w:p>
+        </w:tc>
+        <w:tc>
+          <w:tcPr>
+            <w:tcW w:type="dxa" w:w="7226"/>
+            <w:tcMar>
+              <w:top w:type="dxa" w:w="70"/>
+              <w:left w:type="dxa" w:w="100"/>
+              <w:bottom w:type="dxa" w:w="70"/>
+              <w:right w:type="dxa" w:w="100"/>
+            </w:tcMar>
+          </w:tcPr>
+          <w:p>
+            <w:pPr>
+              <w:keepNext/>
+              <w:spacing w:after="0" w:before="0"/>
+            </w:pPr>
+            <w:r>
+              <w:rPr>
+                <w:sz w:val="20"/>
+                <w:szCs w:val="20"/>
+              </w:rPr>
+              <w:t xml:space="preserve">2.3</w:t>
+            </w:r>
+          </w:p>
+        </w:tc>
+      </w:tr>
+      <w:tr>
+        <w:trPr>
+          <w:cantSplit/>
+        </w:trPr>
+        <w:tc>
+          <w:tcPr>
+            <w:tcW w:type="dxa" w:w="1800"/>
+            <w:shd w:fill="F2F2F2" w:color="auto" w:val="clear"/>
+            <w:tcMar>
+              <w:top w:type="dxa" w:w="70"/>
+              <w:left w:type="dxa" w:w="100"/>
+              <w:bottom w:type="dxa" w:w="70"/>
+              <w:right w:type="dxa" w:w="100"/>
+            </w:tcMar>
+          </w:tcPr>
+          <w:p>
+            <w:pPr>
+              <w:keepNext/>
+              <w:spacing w:after="0"/>
+            </w:pPr>
+            <w:r>
+              <w:rPr>
+                <w:b/>
+                <w:bCs/>
+                <w:color w:val="404040"/>
+                <w:sz w:val="20"/>
+                <w:szCs w:val="20"/>
+              </w:rPr>
+              <w:t xml:space="preserve">Decisión</w:t>
+            </w:r>
+          </w:p>
+        </w:tc>
+        <w:tc>
+          <w:tcPr>
+            <w:tcW w:type="dxa" w:w="7226"/>
+            <w:tcMar>
+              <w:top w:type="dxa" w:w="70"/>
+              <w:left w:type="dxa" w:w="100"/>
+              <w:bottom w:type="dxa" w:w="70"/>
+              <w:right w:type="dxa" w:w="100"/>
+            </w:tcMar>
+          </w:tcPr>
+          <w:p>
+            <w:pPr>
+              <w:keepNext/>
+              <w:spacing w:after="0" w:before="0"/>
+            </w:pPr>
+            <w:r>
+              <w:rPr>
+                <w:sz w:val="20"/>
+                <w:szCs w:val="20"/>
+              </w:rPr>
+              <w:t xml:space="preserve">Las métricas se fijan antes de modelar, para cada una de las cuatro variables objetivo: - Área bajo la curva de precisión y exhaustividad, informada junto a la prevalencia, que es lo que obtiene un modelo al azar, y como cociente entre ambas. - Área bajo la curva ROC. - Puntaje de Brier, junto al de referencia: el que se obtiene al asignar a todos los casos la prevalencia, p(1 − p). - Calibración, con su intercepto (si el nivel general del riesgo es correcto; ideal 0) y su pendiente (si las probabilidades se separan en la medida justa; ideal 1), estimados con una regresión logística del resultado sobre el logit de la probabilidad predicha. - La exactitud no se usa: con tasas de 1 % a 6 %, un modelo que diga siempre «no reingresa» acierta más del 94 % de las veces.</w:t>
+            </w:r>
+          </w:p>
+        </w:tc>
+      </w:tr>
+      <w:tr>
+        <w:trPr>
+          <w:cantSplit/>
+        </w:trPr>
+        <w:tc>
+          <w:tcPr>
+            <w:tcW w:type="dxa" w:w="1800"/>
+            <w:shd w:fill="F2F2F2" w:color="auto" w:val="clear"/>
+            <w:tcMar>
+              <w:top w:type="dxa" w:w="70"/>
+              <w:left w:type="dxa" w:w="100"/>
+              <w:bottom w:type="dxa" w:w="70"/>
+              <w:right w:type="dxa" w:w="100"/>
+            </w:tcMar>
+          </w:tcPr>
+          <w:p>
+            <w:pPr>
+              <w:keepNext/>
+              <w:spacing w:after="0"/>
+            </w:pPr>
+            <w:r>
+              <w:rPr>
+                <w:b/>
+                <w:bCs/>
+                <w:color w:val="404040"/>
+                <w:sz w:val="20"/>
+                <w:szCs w:val="20"/>
+              </w:rPr>
+              <w:t xml:space="preserve">Intervalos de confianza</w:t>
+            </w:r>
+          </w:p>
+        </w:tc>
+        <w:tc>
+          <w:tcPr>
+            <w:tcW w:type="dxa" w:w="7226"/>
+            <w:tcMar>
+              <w:top w:type="dxa" w:w="70"/>
+              <w:left w:type="dxa" w:w="100"/>
+              <w:bottom w:type="dxa" w:w="70"/>
+              <w:right w:type="dxa" w:w="100"/>
+            </w:tcMar>
+          </w:tcPr>
+          <w:p>
+            <w:pPr>
+              <w:keepNext/>
+              <w:spacing w:after="0" w:before="0"/>
+            </w:pPr>
+            <w:r>
+              <w:rPr>
+                <w:sz w:val="20"/>
+                <w:szCs w:val="20"/>
+              </w:rPr>
+              <w:t xml:space="preserve">Al 95 %, por remuestreo de pacientes (</w:t>
+            </w:r>
+            <w:r>
+              <w:rPr>
+                <w:rFonts w:ascii="Consolas" w:cs="Consolas" w:eastAsia="Consolas" w:hAnsi="Consolas"/>
+                <w:sz w:val="18"/>
+                <w:szCs w:val="18"/>
+                <w:shd w:fill="F2F2F2" w:color="auto" w:val="clear"/>
+              </w:rPr>
+              <w:t xml:space="preserve">ID_PACIENTE</w:t>
+            </w:r>
+            <w:r>
+              <w:rPr>
+                <w:sz w:val="20"/>
+                <w:szCs w:val="20"/>
+              </w:rPr>
+              <w:t xml:space="preserve">) con reposición: 1.000 repeticiones con la semilla del proyecto (2026) y los percentiles 2,5 y 97,5. Se remuestrean pacientes y no casos porque los casos de una misma persona no son independientes. Se calculan sobre las predicciones fuera de partición de la validación cruzada, sobre las de la validación temporal (en cada uno de sus tres grupos, </w:t>
+            </w:r>
+            <w:hyperlink w:history="1" w:anchor="E_D40">
+              <w:r>
+                <w:rPr>
+                  <w:color w:val="0563C1"/>
+                  <w:sz w:val="20"/>
+                  <w:szCs w:val="20"/>
+                  <w:u w:val="single"/>
+                </w:rPr>
+                <w:t xml:space="preserve">D40</w:t>
+              </w:r>
+            </w:hyperlink>
+            <w:r>
+              <w:rPr>
+                <w:sz w:val="20"/>
+                <w:szCs w:val="20"/>
+              </w:rPr>
+              <w:t xml:space="preserve">) y sobre las del conjunto de prueba.</w:t>
+            </w:r>
+          </w:p>
+        </w:tc>
+      </w:tr>
+      <w:tr>
+        <w:trPr>
+          <w:cantSplit/>
+        </w:trPr>
+        <w:tc>
+          <w:tcPr>
+            <w:tcW w:type="dxa" w:w="1800"/>
+            <w:shd w:fill="F2F2F2" w:color="auto" w:val="clear"/>
+            <w:tcMar>
+              <w:top w:type="dxa" w:w="70"/>
+              <w:left w:type="dxa" w:w="100"/>
+              <w:bottom w:type="dxa" w:w="70"/>
+              <w:right w:type="dxa" w:w="100"/>
+            </w:tcMar>
+          </w:tcPr>
+          <w:p>
+            <w:pPr>
+              <w:keepNext/>
+              <w:spacing w:after="0"/>
+            </w:pPr>
+            <w:r>
+              <w:rPr>
+                <w:b/>
+                <w:bCs/>
+                <w:color w:val="404040"/>
+                <w:sz w:val="20"/>
+                <w:szCs w:val="20"/>
+              </w:rPr>
+              <w:t xml:space="preserve">Recalibración</w:t>
+            </w:r>
+          </w:p>
+        </w:tc>
+        <w:tc>
+          <w:tcPr>
+            <w:tcW w:type="dxa" w:w="7226"/>
+            <w:tcMar>
+              <w:top w:type="dxa" w:w="70"/>
+              <w:left w:type="dxa" w:w="100"/>
+              <w:bottom w:type="dxa" w:w="70"/>
+              <w:right w:type="dxa" w:w="100"/>
+            </w:tcMar>
+          </w:tcPr>
+          <w:p>
+            <w:pPr>
+              <w:keepNext/>
+              <w:spacing w:after="0" w:before="0"/>
+            </w:pPr>
+            <w:r>
+              <w:rPr>
+                <w:sz w:val="20"/>
+                <w:szCs w:val="20"/>
+              </w:rPr>
+              <w:t xml:space="preserve">Si al entrenar se equilibran las clases (submuestreo, sobremuestreo o pesos), las probabilidades quedan desplazadas hacia arriba y no se pueden leer como riesgo. Antes de evaluar la calibración se recalibran con el método de Platt (una regresión logística sobre el logit de la probabilidad), ajustada con datos que el modelo no usó para entrenar: en la validación cruzada, con una parte de las particiones de entrenamiento separada por paciente; para la evaluación final, con las predicciones fuera de partición del conjunto de desarrollo. Nunca con el conjunto de prueba. Las dos áreas no cambian con la recalibración, porque no cambia el orden de los casos.</w:t>
+            </w:r>
+          </w:p>
+        </w:tc>
+      </w:tr>
+      <w:tr>
+        <w:trPr>
+          <w:cantSplit/>
+        </w:trPr>
+        <w:tc>
+          <w:tcPr>
+            <w:tcW w:type="dxa" w:w="1800"/>
+            <w:shd w:fill="F2F2F2" w:color="auto" w:val="clear"/>
+            <w:tcMar>
+              <w:top w:type="dxa" w:w="70"/>
+              <w:left w:type="dxa" w:w="100"/>
+              <w:bottom w:type="dxa" w:w="70"/>
+              <w:right w:type="dxa" w:w="100"/>
+            </w:tcMar>
+          </w:tcPr>
+          <w:p>
+            <w:pPr>
+              <w:keepNext/>
+              <w:spacing w:after="0"/>
+            </w:pPr>
+            <w:r>
+              <w:rPr>
+                <w:b/>
+                <w:bCs/>
+                <w:color w:val="404040"/>
+                <w:sz w:val="20"/>
+                <w:szCs w:val="20"/>
+              </w:rPr>
+              <w:t xml:space="preserve">Referencias en el conjunto de desarrollo</w:t>
+            </w:r>
+          </w:p>
+        </w:tc>
+        <w:tc>
+          <w:tcPr>
+            <w:tcW w:type="dxa" w:w="7226"/>
+            <w:tcMar>
+              <w:top w:type="dxa" w:w="70"/>
+              <w:left w:type="dxa" w:w="100"/>
+              <w:bottom w:type="dxa" w:w="70"/>
+              <w:right w:type="dxa" w:w="100"/>
+            </w:tcMar>
+          </w:tcPr>
+          <w:tbl>
+            <w:tblPr>
+              <w:tblW w:type="dxa" w:w="7026"/>
+              <w:tblBorders>
+                <w:top w:val="single" w:color="BFBFBF" w:sz="4"/>
+                <w:left w:val="single" w:color="BFBFBF" w:sz="4"/>
+                <w:bottom w:val="single" w:color="BFBFBF" w:sz="4"/>
+                <w:right w:val="single" w:color="BFBFBF" w:sz="4"/>
+                <w:insideH w:val="single" w:color="BFBFBF" w:sz="4"/>
+                <w:insideV w:val="single" w:color="BFBFBF" w:sz="4"/>
+              </w:tblBorders>
+              <w:tblLayout w:type="fixed"/>
+            </w:tblPr>
+            <w:tblGrid>
+              <w:gridCol w:w="1716"/>
+              <w:gridCol w:w="3833"/>
+              <w:gridCol w:w="1477"/>
+            </w:tblGrid>
+            <w:tr>
+              <w:trPr>
+                <w:cantSplit/>
+                <w:tblHeader/>
+              </w:trPr>
+              <w:tc>
+                <w:tcPr>
+                  <w:tcW w:type="dxa" w:w="1716"/>
+                  <w:shd w:fill="D9E2F3" w:color="auto" w:val="clear"/>
+                  <w:tcMar>
+                    <w:top w:type="dxa" w:w="70"/>
+                    <w:left w:type="dxa" w:w="100"/>
+                    <w:bottom w:type="dxa" w:w="70"/>
+                    <w:right w:type="dxa" w:w="100"/>
+                  </w:tcMar>
+                  <w:vAlign w:val="center"/>
+                </w:tcPr>
+                <w:p>
+                  <w:pPr>
+                    <w:spacing w:after="0"/>
+                  </w:pPr>
+                  <w:r>
+                    <w:rPr>
+                      <w:b/>
+                      <w:bCs/>
+                      <w:sz w:val="18"/>
+                      <w:szCs w:val="18"/>
+                    </w:rPr>
+                    <w:t xml:space="preserve">Variable</w:t>
+                  </w:r>
+                </w:p>
+              </w:tc>
+              <w:tc>
+                <w:tcPr>
+                  <w:tcW w:type="dxa" w:w="3833"/>
+                  <w:shd w:fill="D9E2F3" w:color="auto" w:val="clear"/>
+                  <w:tcMar>
+                    <w:top w:type="dxa" w:w="70"/>
+                    <w:left w:type="dxa" w:w="100"/>
+                    <w:bottom w:type="dxa" w:w="70"/>
+                    <w:right w:type="dxa" w:w="100"/>
+                  </w:tcMar>
+                  <w:vAlign w:val="center"/>
+                </w:tcPr>
+                <w:p>
+                  <w:pPr>
+                    <w:spacing w:after="0"/>
+                  </w:pPr>
+                  <w:r>
+                    <w:rPr>
+                      <w:b/>
+                      <w:bCs/>
+                      <w:sz w:val="18"/>
+                      <w:szCs w:val="18"/>
+                    </w:rPr>
+                    <w:t xml:space="preserve">Prevalencia (área de precisión y exhaustividad de un modelo al azar)</w:t>
+                  </w:r>
+                </w:p>
+              </w:tc>
+              <w:tc>
+                <w:tcPr>
+                  <w:tcW w:type="dxa" w:w="1477"/>
+                  <w:shd w:fill="D9E2F3" w:color="auto" w:val="clear"/>
+                  <w:tcMar>
+                    <w:top w:type="dxa" w:w="70"/>
+                    <w:left w:type="dxa" w:w="100"/>
+                    <w:bottom w:type="dxa" w:w="70"/>
+                    <w:right w:type="dxa" w:w="100"/>
+                  </w:tcMar>
+                  <w:vAlign w:val="center"/>
+                </w:tcPr>
+                <w:p>
+                  <w:pPr>
+                    <w:spacing w:after="0"/>
+                  </w:pPr>
+                  <w:r>
+                    <w:rPr>
+                      <w:b/>
+                      <w:bCs/>
+                      <w:sz w:val="18"/>
+                      <w:szCs w:val="18"/>
+                    </w:rPr>
+                    <w:t xml:space="preserve">Brier de referencia</w:t>
+                  </w:r>
+                </w:p>
+              </w:tc>
+            </w:tr>
+            <w:tr>
+              <w:trPr>
+                <w:cantSplit/>
+                <w:tblHeader w:val="off"/>
+              </w:trPr>
+              <w:tc>
+                <w:tcPr>
+                  <w:tcW w:type="dxa" w:w="1716"/>
+                  <w:tcMar>
+                    <w:top w:type="dxa" w:w="70"/>
+                    <w:left w:type="dxa" w:w="100"/>
+                    <w:bottom w:type="dxa" w:w="70"/>
+                    <w:right w:type="dxa" w:w="100"/>
+                  </w:tcMar>
+                  <w:vAlign w:val="center"/>
+                </w:tcPr>
+                <w:p>
+                  <w:pPr>
+                    <w:spacing w:after="0"/>
+                  </w:pPr>
+                  <w:r>
+                    <w:rPr>
+                      <w:rFonts w:ascii="Consolas" w:cs="Consolas" w:eastAsia="Consolas" w:hAnsi="Consolas"/>
+                      <w:sz w:val="16"/>
+                      <w:szCs w:val="16"/>
+                      <w:shd w:fill="F2F2F2" w:color="auto" w:val="clear"/>
+                    </w:rPr>
+                    <w:t xml:space="preserve">REING_7D</w:t>
+                  </w:r>
+                </w:p>
+              </w:tc>
+              <w:tc>
+                <w:tcPr>
+                  <w:tcW w:type="dxa" w:w="3833"/>
+                  <w:tcMar>
+                    <w:top w:type="dxa" w:w="70"/>
+                    <w:left w:type="dxa" w:w="100"/>
+                    <w:bottom w:type="dxa" w:w="70"/>
+                    <w:right w:type="dxa" w:w="100"/>
+                  </w:tcMar>
+                  <w:vAlign w:val="center"/>
+                </w:tcPr>
+                <w:p>
+                  <w:pPr>
+                    <w:spacing w:after="0"/>
+                  </w:pPr>
+                  <w:r>
+                    <w:rPr>
+                      <w:sz w:val="18"/>
+                      <w:szCs w:val="18"/>
+                    </w:rPr>
+                    <w:t xml:space="preserve">0,021</w:t>
+                  </w:r>
+                </w:p>
+              </w:tc>
+              <w:tc>
+                <w:tcPr>
+                  <w:tcW w:type="dxa" w:w="1477"/>
+                  <w:tcMar>
+                    <w:top w:type="dxa" w:w="70"/>
+                    <w:left w:type="dxa" w:w="100"/>
+                    <w:bottom w:type="dxa" w:w="70"/>
+                    <w:right w:type="dxa" w:w="100"/>
+                  </w:tcMar>
+                  <w:vAlign w:val="center"/>
+                </w:tcPr>
+                <w:p>
+                  <w:pPr>
+                    <w:spacing w:after="0"/>
+                  </w:pPr>
+                  <w:r>
+                    <w:rPr>
+                      <w:sz w:val="18"/>
+                      <w:szCs w:val="18"/>
+                    </w:rPr>
+                    <w:t xml:space="preserve">0,0202</w:t>
+                  </w:r>
+                </w:p>
+              </w:tc>
+            </w:tr>
+            <w:tr>
+              <w:trPr>
+                <w:cantSplit/>
+                <w:tblHeader w:val="off"/>
+              </w:trPr>
+              <w:tc>
+                <w:tcPr>
+                  <w:tcW w:type="dxa" w:w="1716"/>
+                  <w:tcMar>
+                    <w:top w:type="dxa" w:w="70"/>
+                    <w:left w:type="dxa" w:w="100"/>
+                    <w:bottom w:type="dxa" w:w="70"/>
+                    <w:right w:type="dxa" w:w="100"/>
+                  </w:tcMar>
+                  <w:vAlign w:val="center"/>
+                </w:tcPr>
+                <w:p>
+                  <w:pPr>
+                    <w:spacing w:after="0"/>
+                  </w:pPr>
+                  <w:r>
+                    <w:rPr>
+                      <w:rFonts w:ascii="Consolas" w:cs="Consolas" w:eastAsia="Consolas" w:hAnsi="Consolas"/>
+                      <w:sz w:val="16"/>
+                      <w:szCs w:val="16"/>
+                      <w:shd w:fill="F2F2F2" w:color="auto" w:val="clear"/>
+                    </w:rPr>
+                    <w:t xml:space="preserve">REING_7D_CDM</w:t>
+                  </w:r>
+                </w:p>
+              </w:tc>
+              <w:tc>
+                <w:tcPr>
+                  <w:tcW w:type="dxa" w:w="3833"/>
+                  <w:tcMar>
+                    <w:top w:type="dxa" w:w="70"/>
+                    <w:left w:type="dxa" w:w="100"/>
+                    <w:bottom w:type="dxa" w:w="70"/>
+                    <w:right w:type="dxa" w:w="100"/>
+                  </w:tcMar>
+                  <w:vAlign w:val="center"/>
+                </w:tcPr>
+                <w:p>
+                  <w:pPr>
+                    <w:spacing w:after="0"/>
+                  </w:pPr>
+                  <w:r>
+                    <w:rPr>
+                      <w:sz w:val="18"/>
+                      <w:szCs w:val="18"/>
+                    </w:rPr>
+                    <w:t xml:space="preserve">0,013</w:t>
+                  </w:r>
+                </w:p>
+              </w:tc>
+              <w:tc>
+                <w:tcPr>
+                  <w:tcW w:type="dxa" w:w="1477"/>
+                  <w:tcMar>
+                    <w:top w:type="dxa" w:w="70"/>
+                    <w:left w:type="dxa" w:w="100"/>
+                    <w:bottom w:type="dxa" w:w="70"/>
+                    <w:right w:type="dxa" w:w="100"/>
+                  </w:tcMar>
+                  <w:vAlign w:val="center"/>
+                </w:tcPr>
+                <w:p>
+                  <w:pPr>
+                    <w:spacing w:after="0"/>
+                  </w:pPr>
+                  <w:r>
+                    <w:rPr>
+                      <w:sz w:val="18"/>
+                      <w:szCs w:val="18"/>
+                    </w:rPr>
+                    <w:t xml:space="preserve">0,0125</w:t>
+                  </w:r>
+                </w:p>
+              </w:tc>
+            </w:tr>
+            <w:tr>
+              <w:trPr>
+                <w:cantSplit/>
+                <w:tblHeader w:val="off"/>
+              </w:trPr>
+              <w:tc>
+                <w:tcPr>
+                  <w:tcW w:type="dxa" w:w="1716"/>
+                  <w:tcMar>
+                    <w:top w:type="dxa" w:w="70"/>
+                    <w:left w:type="dxa" w:w="100"/>
+                    <w:bottom w:type="dxa" w:w="70"/>
+                    <w:right w:type="dxa" w:w="100"/>
+                  </w:tcMar>
+                  <w:vAlign w:val="center"/>
+                </w:tcPr>
+                <w:p>
+                  <w:pPr>
+                    <w:spacing w:after="0"/>
+                  </w:pPr>
+                  <w:r>
+                    <w:rPr>
+                      <w:rFonts w:ascii="Consolas" w:cs="Consolas" w:eastAsia="Consolas" w:hAnsi="Consolas"/>
+                      <w:sz w:val="16"/>
+                      <w:szCs w:val="16"/>
+                      <w:shd w:fill="F2F2F2" w:color="auto" w:val="clear"/>
+                    </w:rPr>
+                    <w:t xml:space="preserve">REING_30D</w:t>
+                  </w:r>
+                </w:p>
+              </w:tc>
+              <w:tc>
+                <w:tcPr>
+                  <w:tcW w:type="dxa" w:w="3833"/>
+                  <w:tcMar>
+                    <w:top w:type="dxa" w:w="70"/>
+                    <w:left w:type="dxa" w:w="100"/>
+                    <w:bottom w:type="dxa" w:w="70"/>
+                    <w:right w:type="dxa" w:w="100"/>
+                  </w:tcMar>
+                  <w:vAlign w:val="center"/>
+                </w:tcPr>
+                <w:p>
+                  <w:pPr>
+                    <w:spacing w:after="0"/>
+                  </w:pPr>
+                  <w:r>
+                    <w:rPr>
+                      <w:sz w:val="18"/>
+                      <w:szCs w:val="18"/>
+                    </w:rPr>
+                    <w:t xml:space="preserve">0,059</w:t>
+                  </w:r>
+                </w:p>
+              </w:tc>
+              <w:tc>
+                <w:tcPr>
+                  <w:tcW w:type="dxa" w:w="1477"/>
+                  <w:tcMar>
+                    <w:top w:type="dxa" w:w="70"/>
+                    <w:left w:type="dxa" w:w="100"/>
+                    <w:bottom w:type="dxa" w:w="70"/>
+                    <w:right w:type="dxa" w:w="100"/>
+                  </w:tcMar>
+                  <w:vAlign w:val="center"/>
+                </w:tcPr>
+                <w:p>
+                  <w:pPr>
+                    <w:spacing w:after="0"/>
+                  </w:pPr>
+                  <w:r>
+                    <w:rPr>
+                      <w:sz w:val="18"/>
+                      <w:szCs w:val="18"/>
+                    </w:rPr>
+                    <w:t xml:space="preserve">0,0555</w:t>
+                  </w:r>
+                </w:p>
+              </w:tc>
+            </w:tr>
+            <w:tr>
+              <w:trPr>
+                <w:cantSplit/>
+                <w:tblHeader w:val="off"/>
+              </w:trPr>
+              <w:tc>
+                <w:tcPr>
+                  <w:tcW w:type="dxa" w:w="1716"/>
+                  <w:tcMar>
+                    <w:top w:type="dxa" w:w="70"/>
+                    <w:left w:type="dxa" w:w="100"/>
+                    <w:bottom w:type="dxa" w:w="70"/>
+                    <w:right w:type="dxa" w:w="100"/>
+                  </w:tcMar>
+                  <w:vAlign w:val="center"/>
+                </w:tcPr>
+                <w:p>
+                  <w:pPr>
+                    <w:spacing w:after="0"/>
+                  </w:pPr>
+                  <w:r>
+                    <w:rPr>
+                      <w:rFonts w:ascii="Consolas" w:cs="Consolas" w:eastAsia="Consolas" w:hAnsi="Consolas"/>
+                      <w:sz w:val="16"/>
+                      <w:szCs w:val="16"/>
+                      <w:shd w:fill="F2F2F2" w:color="auto" w:val="clear"/>
+                    </w:rPr>
+                    <w:t xml:space="preserve">REING_30D_CDM</w:t>
+                  </w:r>
+                </w:p>
+              </w:tc>
+              <w:tc>
+                <w:tcPr>
+                  <w:tcW w:type="dxa" w:w="3833"/>
+                  <w:tcMar>
+                    <w:top w:type="dxa" w:w="70"/>
+                    <w:left w:type="dxa" w:w="100"/>
+                    <w:bottom w:type="dxa" w:w="70"/>
+                    <w:right w:type="dxa" w:w="100"/>
+                  </w:tcMar>
+                  <w:vAlign w:val="center"/>
+                </w:tcPr>
+                <w:p>
+                  <w:pPr>
+                    <w:spacing w:after="0"/>
+                  </w:pPr>
+                  <w:r>
+                    <w:rPr>
+                      <w:sz w:val="18"/>
+                      <w:szCs w:val="18"/>
+                    </w:rPr>
+                    <w:t xml:space="preserve">0,036</w:t>
+                  </w:r>
+                </w:p>
+              </w:tc>
+              <w:tc>
+                <w:tcPr>
+                  <w:tcW w:type="dxa" w:w="1477"/>
+                  <w:tcMar>
+                    <w:top w:type="dxa" w:w="70"/>
+                    <w:left w:type="dxa" w:w="100"/>
+                    <w:bottom w:type="dxa" w:w="70"/>
+                    <w:right w:type="dxa" w:w="100"/>
+                  </w:tcMar>
+                  <w:vAlign w:val="center"/>
+                </w:tcPr>
+                <w:p>
+                  <w:pPr>
+                    <w:spacing w:after="0"/>
+                  </w:pPr>
+                  <w:r>
+                    <w:rPr>
+                      <w:sz w:val="18"/>
+                      <w:szCs w:val="18"/>
+                    </w:rPr>
+                    <w:t xml:space="preserve">0,0343</w:t>
+                  </w:r>
+                </w:p>
+              </w:tc>
+            </w:tr>
+          </w:tbl>
+          <w:p>
+            <w:pPr>
+              <w:spacing w:after="0"/>
+            </w:pPr>
+          </w:p>
+        </w:tc>
+      </w:tr>
+      <w:tr>
+        <w:trPr>
+          <w:cantSplit/>
+        </w:trPr>
+        <w:tc>
+          <w:tcPr>
+            <w:tcW w:type="dxa" w:w="1800"/>
+            <w:shd w:fill="F2F2F2" w:color="auto" w:val="clear"/>
+            <w:tcMar>
+              <w:top w:type="dxa" w:w="70"/>
+              <w:left w:type="dxa" w:w="100"/>
+              <w:bottom w:type="dxa" w:w="70"/>
+              <w:right w:type="dxa" w:w="100"/>
+            </w:tcMar>
+          </w:tcPr>
+          <w:p>
+            <w:pPr>
+              <w:keepNext/>
+              <w:spacing w:after="0"/>
+            </w:pPr>
+            <w:r>
+              <w:rPr>
+                <w:b/>
+                <w:bCs/>
+                <w:color w:val="404040"/>
+                <w:sz w:val="20"/>
+                <w:szCs w:val="20"/>
+              </w:rPr>
+              <w:t xml:space="preserve">Fundamento</w:t>
+            </w:r>
+          </w:p>
+        </w:tc>
+        <w:tc>
+          <w:tcPr>
+            <w:tcW w:type="dxa" w:w="7226"/>
+            <w:tcMar>
+              <w:top w:type="dxa" w:w="70"/>
+              <w:left w:type="dxa" w:w="100"/>
+              <w:bottom w:type="dxa" w:w="70"/>
+              <w:right w:type="dxa" w:w="100"/>
+            </w:tcMar>
+          </w:tcPr>
+          <w:p>
+            <w:pPr>
+              <w:keepNext/>
+              <w:spacing w:after="0" w:before="0"/>
+            </w:pPr>
+            <w:r>
+              <w:rPr>
+                <w:sz w:val="20"/>
+                <w:szCs w:val="20"/>
+              </w:rPr>
+              <w:t xml:space="preserve">Revisión del profesor guía del 13 de octubre de 2026 (punto 2.3): con tasas tan bajas la exactitud no sirve y una sola métrica de discriminación no alcanza; la tasa sube en 2023 y 2024, así que un modelo entrenado con 2019–2022 tenderá a subestimar el riesgo en la validación temporal, lo que mide el intercepto; y equilibrar las clases desplaza las probabilidades. El profesor indicó las métricas, los intervalos por remuestreo de pacientes y la recalibración con datos de validación; las 1.000 repeticiones y el método de Platt son la forma concreta de aplicarlos.</w:t>
+            </w:r>
+          </w:p>
+        </w:tc>
+      </w:tr>
+      <w:tr>
+        <w:trPr>
+          <w:cantSplit/>
+        </w:trPr>
+        <w:tc>
+          <w:tcPr>
+            <w:tcW w:type="dxa" w:w="1800"/>
+            <w:shd w:fill="F2F2F2" w:color="auto" w:val="clear"/>
+            <w:tcMar>
+              <w:top w:type="dxa" w:w="70"/>
+              <w:left w:type="dxa" w:w="100"/>
+              <w:bottom w:type="dxa" w:w="70"/>
+              <w:right w:type="dxa" w:w="100"/>
+            </w:tcMar>
+          </w:tcPr>
+          <w:p>
+            <w:pPr>
+              <w:keepNext/>
+              <w:spacing w:after="0"/>
+            </w:pPr>
+            <w:r>
+              <w:rPr>
+                <w:b/>
+                <w:bCs/>
+                <w:color w:val="404040"/>
+                <w:sz w:val="20"/>
+                <w:szCs w:val="20"/>
+              </w:rPr>
+              <w:t xml:space="preserve">Visto bueno</w:t>
+            </w:r>
+          </w:p>
+        </w:tc>
+        <w:tc>
+          <w:tcPr>
+            <w:tcW w:type="dxa" w:w="7226"/>
+            <w:tcMar>
+              <w:top w:type="dxa" w:w="70"/>
+              <w:left w:type="dxa" w:w="100"/>
+              <w:bottom w:type="dxa" w:w="70"/>
+              <w:right w:type="dxa" w:w="100"/>
+            </w:tcMar>
+          </w:tcPr>
+          <w:p>
+            <w:pPr>
+              <w:keepNext/>
+              <w:spacing w:after="0" w:before="0"/>
+            </w:pPr>
+            <w:r>
+              <w:rPr>
+                <w:sz w:val="20"/>
+                <w:szCs w:val="20"/>
+              </w:rPr>
+              <w:t xml:space="preserve">La persona a cargo de la tesis lo aprobó el 20 de octubre de 2026, por ser lo que indica la revisión.</w:t>
+            </w:r>
+          </w:p>
+        </w:tc>
+      </w:tr>
+      <w:tr>
+        <w:trPr>
+          <w:cantSplit/>
+        </w:trPr>
+        <w:tc>
+          <w:tcPr>
+            <w:tcW w:type="dxa" w:w="1800"/>
+            <w:shd w:fill="F2F2F2" w:color="auto" w:val="clear"/>
+            <w:tcMar>
+              <w:top w:type="dxa" w:w="70"/>
+              <w:left w:type="dxa" w:w="100"/>
+              <w:bottom w:type="dxa" w:w="70"/>
+              <w:right w:type="dxa" w:w="100"/>
+            </w:tcMar>
+          </w:tcPr>
+          <w:p>
+            <w:pPr>
+              <w:keepNext/>
+              <w:spacing w:after="0"/>
+            </w:pPr>
+            <w:r>
+              <w:rPr>
+                <w:b/>
+                <w:bCs/>
+                <w:color w:val="404040"/>
+                <w:sz w:val="20"/>
+                <w:szCs w:val="20"/>
+              </w:rPr>
+              <w:t xml:space="preserve">Completa a</w:t>
+            </w:r>
+          </w:p>
+        </w:tc>
+        <w:tc>
+          <w:tcPr>
+            <w:tcW w:type="dxa" w:w="7226"/>
+            <w:tcMar>
+              <w:top w:type="dxa" w:w="70"/>
+              <w:left w:type="dxa" w:w="100"/>
+              <w:bottom w:type="dxa" w:w="70"/>
+              <w:right w:type="dxa" w:w="100"/>
+            </w:tcMar>
+          </w:tcPr>
+          <w:p>
+            <w:pPr>
+              <w:keepNext/>
+              <w:spacing w:after="0" w:before="0"/>
+            </w:pPr>
+            <w:hyperlink w:history="1" w:anchor="E_D37">
+              <w:r>
+                <w:rPr>
+                  <w:color w:val="0563C1"/>
+                  <w:sz w:val="20"/>
+                  <w:szCs w:val="20"/>
+                  <w:u w:val="single"/>
+                </w:rPr>
+                <w:t xml:space="preserve">D37</w:t>
+              </w:r>
+            </w:hyperlink>
+            <w:r>
+              <w:rPr>
+                <w:sz w:val="20"/>
+                <w:szCs w:val="20"/>
+              </w:rPr>
+              <w:t xml:space="preserve">. La revisión de la calidad del identificador por año que pide el mismo punto está en H28 de la bitácora de la 2.2.</w:t>
+            </w:r>
+          </w:p>
+        </w:tc>
+      </w:tr>
+      <w:tr>
+        <w:trPr>
+          <w:cantSplit/>
+        </w:trPr>
+        <w:tc>
+          <w:tcPr>
+            <w:tcW w:type="dxa" w:w="1800"/>
+            <w:shd w:fill="F2F2F2" w:color="auto" w:val="clear"/>
+            <w:tcMar>
+              <w:top w:type="dxa" w:w="70"/>
+              <w:left w:type="dxa" w:w="100"/>
+              <w:bottom w:type="dxa" w:w="70"/>
+              <w:right w:type="dxa" w:w="100"/>
+            </w:tcMar>
+          </w:tcPr>
+          <w:p>
+            <w:pPr>
+              <w:keepNext w:val="false"/>
+              <w:spacing w:after="0"/>
+            </w:pPr>
+            <w:r>
+              <w:rPr>
+                <w:b/>
+                <w:bCs/>
+                <w:color w:val="404040"/>
+                <w:sz w:val="20"/>
+                <w:szCs w:val="20"/>
+              </w:rPr>
+              <w:t xml:space="preserve">Estado</w:t>
+            </w:r>
+          </w:p>
+        </w:tc>
+        <w:tc>
+          <w:tcPr>
+            <w:tcW w:type="dxa" w:w="7226"/>
+            <w:tcMar>
+              <w:top w:type="dxa" w:w="70"/>
+              <w:left w:type="dxa" w:w="100"/>
+              <w:bottom w:type="dxa" w:w="70"/>
+              <w:right w:type="dxa" w:w="100"/>
+            </w:tcMar>
+          </w:tcPr>
+          <w:p>
+            <w:pPr>
+              <w:keepNext w:val="false"/>
+              <w:spacing w:after="0" w:before="0"/>
+            </w:pPr>
+            <w:r>
+              <w:rPr>
+                <w:sz w:val="20"/>
+                <w:szCs w:val="20"/>
+              </w:rPr>
+              <w:t xml:space="preserve">Adoptada, por recomendación del profesor guía.</w:t>
+            </w:r>
+          </w:p>
+        </w:tc>
+      </w:tr>
+    </w:tbl>
+    <w:p>
+      <w:pPr>
+        <w:pStyle w:val="Heading2"/>
+      </w:pPr>
+      <w:bookmarkStart w:name="E_D42" w:id="8"/>
+      <w:r>
+        <w:rPr>
+          <w:color w:val="548235"/>
+        </w:rPr>
+        <w:t xml:space="preserve">D42</w:t>
+      </w:r>
+      <w:bookmarkEnd w:id="8"/>
+      <w:r>
+        <w:t xml:space="preserve"> · Variables de historia: solo el pasado, ventana de 12 meses y marca de ventana cortada</w:t>
+      </w:r>
+    </w:p>
+    <w:p>
+      <w:pPr>
+        <w:keepNext/>
+        <w:spacing w:after="100"/>
+      </w:pPr>
+      <w:r>
+        <w:rPr>
+          <w:b/>
+          <w:bCs/>
+          <w:color w:val="548235"/>
+          <w:sz w:val="18"/>
+          <w:szCs w:val="18"/>
+        </w:rPr>
+        <w:t xml:space="preserve">Decisión</w:t>
+      </w:r>
+      <w:r>
+        <w:rPr>
+          <w:color w:val="808080"/>
+          <w:sz w:val="18"/>
+          <w:szCs w:val="18"/>
+        </w:rPr>
+        <w:t xml:space="preserve">  ·  20 de octubre de 2026</w:t>
+      </w:r>
+    </w:p>
+    <w:tbl>
+      <w:tblPr>
+        <w:tblW w:type="dxa" w:w="9026"/>
+        <w:tblBorders>
+          <w:top w:val="single" w:color="BFBFBF" w:sz="4"/>
+          <w:left w:val="single" w:color="BFBFBF" w:sz="4"/>
+          <w:bottom w:val="single" w:color="BFBFBF" w:sz="4"/>
+          <w:right w:val="single" w:color="BFBFBF" w:sz="4"/>
+          <w:insideH w:val="single" w:color="BFBFBF" w:sz="4"/>
+          <w:insideV w:val="single" w:color="BFBFBF" w:sz="4"/>
+        </w:tblBorders>
+        <w:tblLayout w:type="fixed"/>
+      </w:tblPr>
+      <w:tblGrid>
+        <w:gridCol w:w="1800"/>
+        <w:gridCol w:w="7226"/>
+      </w:tblGrid>
+      <w:tr>
+        <w:trPr>
+          <w:cantSplit/>
+        </w:trPr>
+        <w:tc>
+          <w:tcPr>
+            <w:tcW w:type="dxa" w:w="1800"/>
+            <w:shd w:fill="F2F2F2" w:color="auto" w:val="clear"/>
+            <w:tcMar>
+              <w:top w:type="dxa" w:w="70"/>
+              <w:left w:type="dxa" w:w="100"/>
+              <w:bottom w:type="dxa" w:w="70"/>
+              <w:right w:type="dxa" w:w="100"/>
+            </w:tcMar>
+          </w:tcPr>
+          <w:p>
+            <w:pPr>
+              <w:keepNext/>
+              <w:spacing w:after="0"/>
+            </w:pPr>
+            <w:r>
+              <w:rPr>
+                <w:b/>
+                <w:bCs/>
+                <w:color w:val="404040"/>
+                <w:sz w:val="20"/>
+                <w:szCs w:val="20"/>
+              </w:rPr>
+              <w:t xml:space="preserve">Actividad</w:t>
+            </w:r>
+          </w:p>
+        </w:tc>
+        <w:tc>
+          <w:tcPr>
+            <w:tcW w:type="dxa" w:w="7226"/>
+            <w:tcMar>
+              <w:top w:type="dxa" w:w="70"/>
+              <w:left w:type="dxa" w:w="100"/>
+              <w:bottom w:type="dxa" w:w="70"/>
+              <w:right w:type="dxa" w:w="100"/>
+            </w:tcMar>
+          </w:tcPr>
+          <w:p>
+            <w:pPr>
+              <w:keepNext/>
+              <w:spacing w:after="0" w:before="0"/>
+            </w:pPr>
+            <w:r>
+              <w:rPr>
+                <w:sz w:val="20"/>
+                <w:szCs w:val="20"/>
+              </w:rPr>
+              <w:t xml:space="preserve">2.3 (se aplica en la Etapa 3 del procedimiento de la propuesta, actividad 3.1 de la Carta Gantt)</w:t>
+            </w:r>
+          </w:p>
+        </w:tc>
+      </w:tr>
+      <w:tr>
+        <w:trPr>
+          <w:cantSplit/>
+        </w:trPr>
+        <w:tc>
+          <w:tcPr>
+            <w:tcW w:type="dxa" w:w="1800"/>
+            <w:shd w:fill="F2F2F2" w:color="auto" w:val="clear"/>
+            <w:tcMar>
+              <w:top w:type="dxa" w:w="70"/>
+              <w:left w:type="dxa" w:w="100"/>
+              <w:bottom w:type="dxa" w:w="70"/>
+              <w:right w:type="dxa" w:w="100"/>
+            </w:tcMar>
+          </w:tcPr>
+          <w:p>
+            <w:pPr>
+              <w:keepNext/>
+              <w:spacing w:after="0"/>
+            </w:pPr>
+            <w:r>
+              <w:rPr>
+                <w:b/>
+                <w:bCs/>
+                <w:color w:val="404040"/>
+                <w:sz w:val="20"/>
+                <w:szCs w:val="20"/>
+              </w:rPr>
+              <w:t xml:space="preserve">Decisión</w:t>
+            </w:r>
+          </w:p>
+        </w:tc>
+        <w:tc>
+          <w:tcPr>
+            <w:tcW w:type="dxa" w:w="7226"/>
+            <w:tcMar>
+              <w:top w:type="dxa" w:w="70"/>
+              <w:left w:type="dxa" w:w="100"/>
+              <w:bottom w:type="dxa" w:w="70"/>
+              <w:right w:type="dxa" w:w="100"/>
+            </w:tcMar>
+          </w:tcPr>
+          <w:p>
+            <w:pPr>
+              <w:keepNext/>
+              <w:spacing w:after="0" w:before="0"/>
+            </w:pPr>
+            <w:r>
+              <w:rPr>
+                <w:sz w:val="20"/>
+                <w:szCs w:val="20"/>
+              </w:rPr>
+              <w:t xml:space="preserve">Las variables que se construyan con la historia del paciente, como el número de hospitalizaciones previas que lista la propuesta, siguen tres reglas: - Solo usan egresos del mismo identificador de paciente cuya alta es anterior al ingreso índice: el ingreso que abre el episodio asistencial del caso de estudio. Nunca egresos posteriores, ni los tramos de traslado del propio episodio. - La ventana es de 12 meses antes del ingreso índice. - Se marcan los casos cuya ventana empieza antes del inicio de su bloque de identificador: los que tienen el ingreso índice antes del 1 de enero de 2020 en el bloque A, o antes del 1 de enero de 2022 en el bloque B. En ellos, un 0 puede significar falta de datos y no ausencia de hospitalizaciones. La marca no excluye casos.</w:t>
+            </w:r>
+          </w:p>
+        </w:tc>
+      </w:tr>
+      <w:tr>
+        <w:trPr>
+          <w:cantSplit/>
+        </w:trPr>
+        <w:tc>
+          <w:tcPr>
+            <w:tcW w:type="dxa" w:w="1800"/>
+            <w:shd w:fill="F2F2F2" w:color="auto" w:val="clear"/>
+            <w:tcMar>
+              <w:top w:type="dxa" w:w="70"/>
+              <w:left w:type="dxa" w:w="100"/>
+              <w:bottom w:type="dxa" w:w="70"/>
+              <w:right w:type="dxa" w:w="100"/>
+            </w:tcMar>
+          </w:tcPr>
+          <w:p>
+            <w:pPr>
+              <w:keepNext/>
+              <w:spacing w:after="0"/>
+            </w:pPr>
+            <w:r>
+              <w:rPr>
+                <w:b/>
+                <w:bCs/>
+                <w:color w:val="404040"/>
+                <w:sz w:val="20"/>
+                <w:szCs w:val="20"/>
+              </w:rPr>
+              <w:t xml:space="preserve">Fundamento</w:t>
+            </w:r>
+          </w:p>
+        </w:tc>
+        <w:tc>
+          <w:tcPr>
+            <w:tcW w:type="dxa" w:w="7226"/>
+            <w:tcMar>
+              <w:top w:type="dxa" w:w="70"/>
+              <w:left w:type="dxa" w:w="100"/>
+              <w:bottom w:type="dxa" w:w="70"/>
+              <w:right w:type="dxa" w:w="100"/>
+            </w:tcMar>
+          </w:tcPr>
+          <w:p>
+            <w:pPr>
+              <w:keepNext/>
+              <w:spacing w:after="0" w:before="0"/>
+            </w:pPr>
+            <w:r>
+              <w:rPr>
+                <w:sz w:val="20"/>
+                <w:szCs w:val="20"/>
+              </w:rPr>
+              <w:t xml:space="preserve">Revisión del profesor guía del 13 de octubre de 2026 (punto 2.5). Una variable de historia que usara egresos posteriores al ingreso le daría al modelo información del futuro. Además, la historia está cortada al comienzo de cada bloque: la base parte en 2019, y los egresos de 2019 y 2020 tienen otro identificador que los de 2021 en adelante (</w:t>
+            </w:r>
+            <w:hyperlink w:history="1" w:anchor="E_H19">
+              <w:r>
+                <w:rPr>
+                  <w:color w:val="0563C1"/>
+                  <w:sz w:val="20"/>
+                  <w:szCs w:val="20"/>
+                  <w:u w:val="single"/>
+                </w:rPr>
+                <w:t xml:space="preserve">H19</w:t>
+              </w:r>
+            </w:hyperlink>
+            <w:r>
+              <w:rPr>
+                <w:sz w:val="20"/>
+                <w:szCs w:val="20"/>
+              </w:rPr>
+              <w:t xml:space="preserve">). Por eso, en el conjunto de desarrollo, el porcentaje de casos con alguna hospitalización en los 12 meses previos es de 5,9 % en enero de 2019 y de 25,9 % en diciembre de 2019; de 4,4 % en enero de 2021 y de 22,9 % en diciembre de 2021, y de 23 % a 28 % entre 2022 y 2024. Los pacientes no cambian: cambia lo que se puede ver.</w:t>
+            </w:r>
+          </w:p>
+        </w:tc>
+      </w:tr>
+      <w:tr>
+        <w:trPr>
+          <w:cantSplit/>
+        </w:trPr>
+        <w:tc>
+          <w:tcPr>
+            <w:tcW w:type="dxa" w:w="1800"/>
+            <w:shd w:fill="F2F2F2" w:color="auto" w:val="clear"/>
+            <w:tcMar>
+              <w:top w:type="dxa" w:w="70"/>
+              <w:left w:type="dxa" w:w="100"/>
+              <w:bottom w:type="dxa" w:w="70"/>
+              <w:right w:type="dxa" w:w="100"/>
+            </w:tcMar>
+          </w:tcPr>
+          <w:p>
+            <w:pPr>
+              <w:keepNext/>
+              <w:spacing w:after="0"/>
+            </w:pPr>
+            <w:r>
+              <w:rPr>
+                <w:b/>
+                <w:bCs/>
+                <w:color w:val="404040"/>
+                <w:sz w:val="20"/>
+                <w:szCs w:val="20"/>
+              </w:rPr>
+              <w:t xml:space="preserve">Magnitud</w:t>
+            </w:r>
+          </w:p>
+        </w:tc>
+        <w:tc>
+          <w:tcPr>
+            <w:tcW w:type="dxa" w:w="7226"/>
+            <w:tcMar>
+              <w:top w:type="dxa" w:w="70"/>
+              <w:left w:type="dxa" w:w="100"/>
+              <w:bottom w:type="dxa" w:w="70"/>
+              <w:right w:type="dxa" w:w="100"/>
+            </w:tcMar>
+          </w:tcPr>
+          <w:p>
+            <w:pPr>
+              <w:keepNext/>
+              <w:spacing w:after="0" w:before="0"/>
+            </w:pPr>
+            <w:r>
+              <w:rPr>
+                <w:sz w:val="20"/>
+                <w:szCs w:val="20"/>
+              </w:rPr>
+              <w:t xml:space="preserve">Con 12 meses quedan marcados 1.465.830 de los 4.192.410 casos de estudio (34,96 %) y 1.173.474 de los 3.354.118 del conjunto de desarrollo (34,99 %): todos los de 2019 y 2021, y cerca del 2 % de los de 2020 y 2022, cuyo episodio comenzó el año anterior. En 59.557 casos de estudio el ingreso índice es anterior al ingreso de su propio egreso, porque el episodio incluye un traslado.</w:t>
+            </w:r>
+          </w:p>
+        </w:tc>
+      </w:tr>
+      <w:tr>
+        <w:trPr>
+          <w:cantSplit/>
+        </w:trPr>
+        <w:tc>
+          <w:tcPr>
+            <w:tcW w:type="dxa" w:w="1800"/>
+            <w:shd w:fill="F2F2F2" w:color="auto" w:val="clear"/>
+            <w:tcMar>
+              <w:top w:type="dxa" w:w="70"/>
+              <w:left w:type="dxa" w:w="100"/>
+              <w:bottom w:type="dxa" w:w="70"/>
+              <w:right w:type="dxa" w:w="100"/>
+            </w:tcMar>
+          </w:tcPr>
+          <w:p>
+            <w:pPr>
+              <w:keepNext/>
+              <w:spacing w:after="0"/>
+            </w:pPr>
+            <w:r>
+              <w:rPr>
+                <w:b/>
+                <w:bCs/>
+                <w:color w:val="404040"/>
+                <w:sz w:val="20"/>
+                <w:szCs w:val="20"/>
+              </w:rPr>
+              <w:t xml:space="preserve">Alternativa</w:t>
+            </w:r>
+          </w:p>
+        </w:tc>
+        <w:tc>
+          <w:tcPr>
+            <w:tcW w:type="dxa" w:w="7226"/>
+            <w:tcMar>
+              <w:top w:type="dxa" w:w="70"/>
+              <w:left w:type="dxa" w:w="100"/>
+              <w:bottom w:type="dxa" w:w="70"/>
+              <w:right w:type="dxa" w:w="100"/>
+            </w:tcMar>
+          </w:tcPr>
+          <w:p>
+            <w:pPr>
+              <w:keepNext/>
+              <w:spacing w:after="0" w:before="0"/>
+            </w:pPr>
+            <w:r>
+              <w:rPr>
+                <w:sz w:val="20"/>
+                <w:szCs w:val="20"/>
+              </w:rPr>
+              <w:t xml:space="preserve">Una ventana de 6 meses marcaría cerca de la mitad de los casos de 2019 y de 2021 (17,6 % del total), pero miraría menos pasado. Se adopta la de 12 meses que sugiere el profesor guía; es también la de la variable de hospitalizaciones previas del puntaje HOSPITAL de predicción de reingreso.</w:t>
+            </w:r>
+          </w:p>
+        </w:tc>
+      </w:tr>
+      <w:tr>
+        <w:trPr>
+          <w:cantSplit/>
+        </w:trPr>
+        <w:tc>
+          <w:tcPr>
+            <w:tcW w:type="dxa" w:w="1800"/>
+            <w:shd w:fill="F2F2F2" w:color="auto" w:val="clear"/>
+            <w:tcMar>
+              <w:top w:type="dxa" w:w="70"/>
+              <w:left w:type="dxa" w:w="100"/>
+              <w:bottom w:type="dxa" w:w="70"/>
+              <w:right w:type="dxa" w:w="100"/>
+            </w:tcMar>
+          </w:tcPr>
+          <w:p>
+            <w:pPr>
+              <w:keepNext/>
+              <w:spacing w:after="0"/>
+            </w:pPr>
+            <w:r>
+              <w:rPr>
+                <w:b/>
+                <w:bCs/>
+                <w:color w:val="404040"/>
+                <w:sz w:val="20"/>
+                <w:szCs w:val="20"/>
+              </w:rPr>
+              <w:t xml:space="preserve">Aplicación</w:t>
+            </w:r>
+          </w:p>
+        </w:tc>
+        <w:tc>
+          <w:tcPr>
+            <w:tcW w:type="dxa" w:w="7226"/>
+            <w:tcMar>
+              <w:top w:type="dxa" w:w="70"/>
+              <w:left w:type="dxa" w:w="100"/>
+              <w:bottom w:type="dxa" w:w="70"/>
+              <w:right w:type="dxa" w:w="100"/>
+            </w:tcMar>
+          </w:tcPr>
+          <w:p>
+            <w:pPr>
+              <w:keepNext/>
+              <w:spacing w:after="0" w:before="0"/>
+            </w:pPr>
+            <w:r>
+              <w:rPr>
+                <w:sz w:val="20"/>
+                <w:szCs w:val="20"/>
+              </w:rPr>
+              <w:t xml:space="preserve">En la Etapa 3 (actividad 3.1), junto con las variables de historia. La marca depende solo de la fecha del ingreso índice y del bloque, así que no hace falta cambiar ahora el conjunto analítico ni el conjunto de prueba sellado.</w:t>
+            </w:r>
+          </w:p>
+        </w:tc>
+      </w:tr>
+      <w:tr>
+        <w:trPr>
+          <w:cantSplit/>
+        </w:trPr>
+        <w:tc>
+          <w:tcPr>
+            <w:tcW w:type="dxa" w:w="1800"/>
+            <w:shd w:fill="F2F2F2" w:color="auto" w:val="clear"/>
+            <w:tcMar>
+              <w:top w:type="dxa" w:w="70"/>
+              <w:left w:type="dxa" w:w="100"/>
+              <w:bottom w:type="dxa" w:w="70"/>
+              <w:right w:type="dxa" w:w="100"/>
+            </w:tcMar>
+          </w:tcPr>
+          <w:p>
+            <w:pPr>
+              <w:keepNext/>
+              <w:spacing w:after="0"/>
+            </w:pPr>
+            <w:r>
+              <w:rPr>
+                <w:b/>
+                <w:bCs/>
+                <w:color w:val="404040"/>
+                <w:sz w:val="20"/>
+                <w:szCs w:val="20"/>
+              </w:rPr>
+              <w:t xml:space="preserve">Visto bueno</w:t>
+            </w:r>
+          </w:p>
+        </w:tc>
+        <w:tc>
+          <w:tcPr>
+            <w:tcW w:type="dxa" w:w="7226"/>
+            <w:tcMar>
+              <w:top w:type="dxa" w:w="70"/>
+              <w:left w:type="dxa" w:w="100"/>
+              <w:bottom w:type="dxa" w:w="70"/>
+              <w:right w:type="dxa" w:w="100"/>
+            </w:tcMar>
+          </w:tcPr>
+          <w:p>
+            <w:pPr>
+              <w:keepNext/>
+              <w:spacing w:after="0" w:before="0"/>
+            </w:pPr>
+            <w:r>
+              <w:rPr>
+                <w:sz w:val="20"/>
+                <w:szCs w:val="20"/>
+              </w:rPr>
+              <w:t xml:space="preserve">La persona a cargo de la tesis lo aprobó el 20 de octubre de 2026 («sí, hazlo como lo sugiere el profesor»).</w:t>
+            </w:r>
+          </w:p>
+        </w:tc>
+      </w:tr>
+      <w:tr>
+        <w:trPr>
+          <w:cantSplit/>
+        </w:trPr>
+        <w:tc>
+          <w:tcPr>
+            <w:tcW w:type="dxa" w:w="1800"/>
+            <w:shd w:fill="F2F2F2" w:color="auto" w:val="clear"/>
+            <w:tcMar>
+              <w:top w:type="dxa" w:w="70"/>
+              <w:left w:type="dxa" w:w="100"/>
+              <w:bottom w:type="dxa" w:w="70"/>
+              <w:right w:type="dxa" w:w="100"/>
+            </w:tcMar>
+          </w:tcPr>
+          <w:p>
+            <w:pPr>
+              <w:keepNext/>
+              <w:spacing w:after="0"/>
+            </w:pPr>
+            <w:r>
+              <w:rPr>
+                <w:b/>
+                <w:bCs/>
+                <w:color w:val="404040"/>
+                <w:sz w:val="20"/>
+                <w:szCs w:val="20"/>
+              </w:rPr>
+              <w:t xml:space="preserve">Precisa a</w:t>
+            </w:r>
+          </w:p>
+        </w:tc>
+        <w:tc>
+          <w:tcPr>
+            <w:tcW w:type="dxa" w:w="7226"/>
+            <w:tcMar>
+              <w:top w:type="dxa" w:w="70"/>
+              <w:left w:type="dxa" w:w="100"/>
+              <w:bottom w:type="dxa" w:w="70"/>
+              <w:right w:type="dxa" w:w="100"/>
+            </w:tcMar>
+          </w:tcPr>
+          <w:p>
+            <w:pPr>
+              <w:keepNext/>
+              <w:spacing w:after="0" w:before="0"/>
+            </w:pPr>
+            <w:r>
+              <w:rPr>
+                <w:sz w:val="20"/>
+                <w:szCs w:val="20"/>
+              </w:rPr>
+              <w:t xml:space="preserve">la advertencia de </w:t>
+            </w:r>
+            <w:hyperlink w:history="1" w:anchor="E_D29">
+              <w:r>
+                <w:rPr>
+                  <w:color w:val="0563C1"/>
+                  <w:sz w:val="20"/>
+                  <w:szCs w:val="20"/>
+                  <w:u w:val="single"/>
+                </w:rPr>
+                <w:t xml:space="preserve">D29</w:t>
+              </w:r>
+            </w:hyperlink>
+            <w:r>
+              <w:rPr>
+                <w:sz w:val="20"/>
+                <w:szCs w:val="20"/>
+              </w:rPr>
+              <w:t xml:space="preserve"> y la de H18 de la bitácora de la 2.2, que hablaban de los egresos anteriores al alta.</w:t>
+            </w:r>
+          </w:p>
+        </w:tc>
+      </w:tr>
+      <w:tr>
+        <w:trPr>
+          <w:cantSplit/>
+        </w:trPr>
+        <w:tc>
+          <w:tcPr>
+            <w:tcW w:type="dxa" w:w="1800"/>
+            <w:shd w:fill="F2F2F2" w:color="auto" w:val="clear"/>
+            <w:tcMar>
+              <w:top w:type="dxa" w:w="70"/>
+              <w:left w:type="dxa" w:w="100"/>
+              <w:bottom w:type="dxa" w:w="70"/>
+              <w:right w:type="dxa" w:w="100"/>
+            </w:tcMar>
+          </w:tcPr>
+          <w:p>
+            <w:pPr>
+              <w:keepNext w:val="false"/>
+              <w:spacing w:after="0"/>
+            </w:pPr>
+            <w:r>
+              <w:rPr>
+                <w:b/>
+                <w:bCs/>
+                <w:color w:val="404040"/>
+                <w:sz w:val="20"/>
+                <w:szCs w:val="20"/>
+              </w:rPr>
+              <w:t xml:space="preserve">Estado</w:t>
+            </w:r>
+          </w:p>
+        </w:tc>
+        <w:tc>
+          <w:tcPr>
+            <w:tcW w:type="dxa" w:w="7226"/>
+            <w:tcMar>
+              <w:top w:type="dxa" w:w="70"/>
+              <w:left w:type="dxa" w:w="100"/>
+              <w:bottom w:type="dxa" w:w="70"/>
+              <w:right w:type="dxa" w:w="100"/>
+            </w:tcMar>
+          </w:tcPr>
+          <w:p>
+            <w:pPr>
+              <w:keepNext w:val="false"/>
+              <w:spacing w:after="0" w:before="0"/>
+            </w:pPr>
+            <w:r>
+              <w:rPr>
+                <w:sz w:val="20"/>
+                <w:szCs w:val="20"/>
+              </w:rPr>
+              <w:t xml:space="preserve">Adoptada, por recomendación del profesor guía.</w:t>
             </w:r>
           </w:p>
         </w:tc>
@@ -5016,6 +9149,48 @@
       </w:pPr>
       <w:r>
         <w:t xml:space="preserve">Las tasas del reporte 10 coinciden con el recálculo.</w:t>
+      </w:r>
+    </w:p>
+    <w:p>
+      <w:r>
+        <w:t xml:space="preserve">El 20 de octubre de 2026 el script se volvió a ejecutar sobre la versión 2 del conjunto analítico. Antes se guardó una copia de la lista de identificadores y del conjunto de cada egreso de la versión 1: la comparación no encontró ningún identificador (de 4.035.768) ni ningún egreso (de 5.780.628) en un conjunto distinto, y la lista de identificadores quedó con el mismo hash. El contraste independiente volvió a cumplir sus 21 comprobaciones sobre la versión 2.</w:t>
+      </w:r>
+    </w:p>
+    <w:p>
+      <w:pPr>
+        <w:pStyle w:val="Heading1"/>
+      </w:pPr>
+      <w:r>
+        <w:t xml:space="preserve">Verificación del script 13</w:t>
+      </w:r>
+    </w:p>
+    <w:p>
+      <w:r>
+        <w:t xml:space="preserve">El script se ejecutó el 20 de octubre de 2026 sobre el conjunto de desarrollo de la versión 2 de la partición, sin abrir el conjunto de prueba. El contraste independiente está en </w:t>
+      </w:r>
+      <w:r>
+        <w:rPr>
+          <w:rFonts w:ascii="Consolas" w:cs="Consolas" w:eastAsia="Consolas" w:hAnsi="Consolas"/>
+          <w:sz w:val="20"/>
+          <w:szCs w:val="20"/>
+          <w:shd w:fill="F2F2F2" w:color="auto" w:val="clear"/>
+        </w:rPr>
+        <w:t xml:space="preserve">2.3_validacion_particion/pruebas/verificar_13_validacion_temporal.py</w:t>
+      </w:r>
+      <w:r>
+        <w:t xml:space="preserve"> y deja </w:t>
+      </w:r>
+      <w:r>
+        <w:rPr>
+          <w:rFonts w:ascii="Consolas" w:cs="Consolas" w:eastAsia="Consolas" w:hAnsi="Consolas"/>
+          <w:sz w:val="20"/>
+          <w:szCs w:val="20"/>
+          <w:shd w:fill="F2F2F2" w:color="auto" w:val="clear"/>
+        </w:rPr>
+        <w:t xml:space="preserve">reportes/pruebas_validacion_temporal.md</w:t>
+      </w:r>
+      <w:r>
+        <w:t xml:space="preserve">. Vuelve a calcular los grupos por otro camino (el año sale de la fecha de alta y los pacientes ya vistos, de agrupar por identificador con pyarrow) y se cumplen sus 9 comprobaciones: el archivo tiene exactamente los 3.354.118 casos de estudio de desarrollo, el período y la marca de paciente ya visto coinciden caso por caso, el archivo no contiene nada que dependa de las variables objetivo y la tabla del reporte 13 coincide con el recálculo.</w:t>
       </w:r>
     </w:p>
     <w:p>
@@ -5036,7 +9211,7 @@
         <w:spacing w:after="80"/>
       </w:pPr>
       <w:r>
-        <w:t xml:space="preserve">Presentar al profesor guía, el 9 de octubre de 2026, las decisiones </w:t>
+        <w:t xml:space="preserve">Presentar al profesor guía las decisiones </w:t>
       </w:r>
       <w:hyperlink w:history="1" w:anchor="E_D27">
         <w:r>
@@ -5072,7 +9247,7 @@
         </w:r>
       </w:hyperlink>
       <w:r>
-        <w:t xml:space="preserve">.</w:t>
+        <w:t xml:space="preserve">. Las revisó el 13 de octubre de 2026 y las aprobó a condición de incorporar los puntos 2.2 y 2.3 de su revisión.</w:t>
       </w:r>
     </w:p>
     <w:p>
@@ -5085,19 +9260,19 @@
         <w:spacing w:after="80"/>
       </w:pPr>
       <w:r>
-        <w:t xml:space="preserve">Declarar en el informe la limitación descrita en </w:t>
-      </w:r>
-      <w:hyperlink w:history="1" w:anchor="E_H19">
+        <w:t xml:space="preserve">Punto 2.2 de la revisión: informar la validación temporal de tres maneras. Hecho el 20 de octubre de 2026 (</w:t>
+      </w:r>
+      <w:hyperlink w:history="1" w:anchor="E_D40">
         <w:r>
           <w:rPr>
             <w:color w:val="0563C1"/>
             <w:u w:val="single"/>
           </w:rPr>
-          <w:t xml:space="preserve">H19</w:t>
+          <w:t xml:space="preserve">D40</w:t>
         </w:r>
       </w:hyperlink>
       <w:r>
-        <w:t xml:space="preserve">.</w:t>
+        <w:t xml:space="preserve">, script 13).</w:t>
       </w:r>
     </w:p>
     <w:p>
@@ -5110,6 +9285,205 @@
         <w:spacing w:after="80"/>
       </w:pPr>
       <w:r>
+        <w:t xml:space="preserve">Punto 2.3 de la revisión: fijar antes de modelar las métricas, los intervalos y la recalibración (</w:t>
+      </w:r>
+      <w:hyperlink w:history="1" w:anchor="E_D41">
+        <w:r>
+          <w:rPr>
+            <w:color w:val="0563C1"/>
+            <w:u w:val="single"/>
+          </w:rPr>
+          <w:t xml:space="preserve">D41</w:t>
+        </w:r>
+      </w:hyperlink>
+      <w:r>
+        <w:t xml:space="preserve">) y revisar por año los identificadores faltantes o ambiguos (H28 de la bitácora de la 2.2). Hecho el 20 de octubre de 2026.</w:t>
+      </w:r>
+    </w:p>
+    <w:p>
+      <w:pPr>
+        <w:pStyle w:val="ListParagraph"/>
+        <w:numPr>
+          <w:ilvl w:val="0"/>
+          <w:numId w:val="4"/>
+        </w:numPr>
+        <w:spacing w:after="80"/>
+      </w:pPr>
+      <w:r>
+        <w:t xml:space="preserve">Presentar al profesor guía, en el próximo avance, </w:t>
+      </w:r>
+      <w:hyperlink w:history="1" w:anchor="E_D40">
+        <w:r>
+          <w:rPr>
+            <w:color w:val="0563C1"/>
+            <w:u w:val="single"/>
+          </w:rPr>
+          <w:t xml:space="preserve">D40</w:t>
+        </w:r>
+      </w:hyperlink>
+      <w:r>
+        <w:t xml:space="preserve"> y </w:t>
+      </w:r>
+      <w:hyperlink w:history="1" w:anchor="E_D41">
+        <w:r>
+          <w:rPr>
+            <w:color w:val="0563C1"/>
+            <w:u w:val="single"/>
+          </w:rPr>
+          <w:t xml:space="preserve">D41</w:t>
+        </w:r>
+      </w:hyperlink>
+      <w:r>
+        <w:t xml:space="preserve">.</w:t>
+      </w:r>
+    </w:p>
+    <w:p>
+      <w:pPr>
+        <w:pStyle w:val="ListParagraph"/>
+        <w:numPr>
+          <w:ilvl w:val="0"/>
+          <w:numId w:val="4"/>
+        </w:numPr>
+        <w:spacing w:after="80"/>
+      </w:pPr>
+      <w:r>
+        <w:t xml:space="preserve">En las etapas de modelado, evaluar con los grupos de </w:t>
+      </w:r>
+      <w:r>
+        <w:rPr>
+          <w:rFonts w:ascii="Consolas" w:cs="Consolas" w:eastAsia="Consolas" w:hAnsi="Consolas"/>
+          <w:sz w:val="20"/>
+          <w:szCs w:val="20"/>
+          <w:shd w:fill="F2F2F2" w:color="auto" w:val="clear"/>
+        </w:rPr>
+        <w:t xml:space="preserve">data/processed/validacion_temporal.parquet</w:t>
+      </w:r>
+      <w:r>
+        <w:t xml:space="preserve"> y con las métricas de </w:t>
+      </w:r>
+      <w:hyperlink w:history="1" w:anchor="E_D41">
+        <w:r>
+          <w:rPr>
+            <w:color w:val="0563C1"/>
+            <w:u w:val="single"/>
+          </w:rPr>
+          <w:t xml:space="preserve">D41</w:t>
+        </w:r>
+      </w:hyperlink>
+      <w:r>
+        <w:t xml:space="preserve">.</w:t>
+      </w:r>
+    </w:p>
+    <w:p>
+      <w:pPr>
+        <w:pStyle w:val="ListParagraph"/>
+        <w:numPr>
+          <w:ilvl w:val="0"/>
+          <w:numId w:val="3"/>
+        </w:numPr>
+        <w:spacing w:after="80"/>
+      </w:pPr>
+      <w:r>
+        <w:t xml:space="preserve">Punto 2.5 de la revisión: fijar la ventana de historia. Hecho el 20 de octubre de 2026: 12 meses (</w:t>
+      </w:r>
+      <w:hyperlink w:history="1" w:anchor="E_D42">
+        <w:r>
+          <w:rPr>
+            <w:color w:val="0563C1"/>
+            <w:u w:val="single"/>
+          </w:rPr>
+          <w:t xml:space="preserve">D42</w:t>
+        </w:r>
+      </w:hyperlink>
+      <w:r>
+        <w:t xml:space="preserve">).</w:t>
+      </w:r>
+    </w:p>
+    <w:p>
+      <w:pPr>
+        <w:pStyle w:val="ListParagraph"/>
+        <w:numPr>
+          <w:ilvl w:val="0"/>
+          <w:numId w:val="4"/>
+        </w:numPr>
+        <w:spacing w:after="80"/>
+      </w:pPr>
+      <w:r>
+        <w:t xml:space="preserve">En la Etapa 3 (actividad 3.1), construir las variables de historia y la marca de ventana cortada según </w:t>
+      </w:r>
+      <w:hyperlink w:history="1" w:anchor="E_D42">
+        <w:r>
+          <w:rPr>
+            <w:color w:val="0563C1"/>
+            <w:u w:val="single"/>
+          </w:rPr>
+          <w:t xml:space="preserve">D42</w:t>
+        </w:r>
+      </w:hyperlink>
+      <w:r>
+        <w:t xml:space="preserve">.</w:t>
+      </w:r>
+    </w:p>
+    <w:p>
+      <w:pPr>
+        <w:pStyle w:val="ListParagraph"/>
+        <w:numPr>
+          <w:ilvl w:val="0"/>
+          <w:numId w:val="4"/>
+        </w:numPr>
+        <w:spacing w:after="80"/>
+      </w:pPr>
+      <w:r>
+        <w:t xml:space="preserve">Presentar al profesor guía </w:t>
+      </w:r>
+      <w:hyperlink w:history="1" w:anchor="E_D42">
+        <w:r>
+          <w:rPr>
+            <w:color w:val="0563C1"/>
+            <w:u w:val="single"/>
+          </w:rPr>
+          <w:t xml:space="preserve">D42</w:t>
+        </w:r>
+      </w:hyperlink>
+      <w:r>
+        <w:t xml:space="preserve"> en el próximo avance.</w:t>
+      </w:r>
+    </w:p>
+    <w:p>
+      <w:pPr>
+        <w:pStyle w:val="ListParagraph"/>
+        <w:numPr>
+          <w:ilvl w:val="0"/>
+          <w:numId w:val="4"/>
+        </w:numPr>
+        <w:spacing w:after="80"/>
+      </w:pPr>
+      <w:r>
+        <w:t xml:space="preserve">Declarar en el informe la limitación descrita en </w:t>
+      </w:r>
+      <w:hyperlink w:history="1" w:anchor="E_H19">
+        <w:r>
+          <w:rPr>
+            <w:color w:val="0563C1"/>
+            <w:u w:val="single"/>
+          </w:rPr>
+          <w:t xml:space="preserve">H19</w:t>
+        </w:r>
+      </w:hyperlink>
+      <w:r>
+        <w:t xml:space="preserve">.</w:t>
+      </w:r>
+    </w:p>
+    <w:p>
+      <w:pPr>
+        <w:pStyle w:val="ListParagraph"/>
+        <w:numPr>
+          <w:ilvl w:val="0"/>
+          <w:numId w:val="4"/>
+        </w:numPr>
+        <w:spacing w:after="80"/>
+      </w:pPr>
+      <w:r>
         <w:t xml:space="preserve">En las etapas siguientes, leer solo </w:t>
       </w:r>
       <w:r>
@@ -5142,7 +9516,7 @@
         <w:pStyle w:val="ListParagraph"/>
         <w:numPr>
           <w:ilvl w:val="0"/>
-          <w:numId w:val="3"/>
+          <w:numId w:val="4"/>
         </w:numPr>
         <w:spacing w:after="80"/>
       </w:pPr>
@@ -5434,6 +9808,12 @@
     </w:lvlOverride>
   </w:num>
   <w:num w:numId="3">
+    <w:abstractNumId w:val="3"/>
+    <w:lvlOverride w:ilvl="0">
+      <w:startOverride w:val="1"/>
+    </w:lvlOverride>
+  </w:num>
+  <w:num w:numId="4">
     <w:abstractNumId w:val="2"/>
     <w:lvlOverride w:ilvl="0">
       <w:startOverride w:val="1"/>

</xml_diff>